<commit_message>
Added sections 7.1, 7.2, 7.3, 7.4 and 7.5 to word documentation
</commit_message>
<xml_diff>
--- a/Maisteriprojektin dokumentaatio.docx
+++ b/Maisteriprojektin dokumentaatio.docx
@@ -1,6 +1,6 @@
 
 <file path=word/document.xml><?xml version="1.0" encoding="utf-8"?>
-<w:document xmlns:wpc="http://schemas.microsoft.com/office/word/2010/wordprocessingCanvas" xmlns:cx="http://schemas.microsoft.com/office/drawing/2014/chartex" xmlns:cx1="http://schemas.microsoft.com/office/drawing/2015/9/8/chartex" xmlns:cx2="http://schemas.microsoft.com/office/drawing/2015/10/21/chartex" xmlns:cx3="http://schemas.microsoft.com/office/drawing/2016/5/9/chartex" xmlns:cx4="http://schemas.microsoft.com/office/drawing/2016/5/10/chartex" xmlns:cx5="http://schemas.microsoft.com/office/drawing/2016/5/11/chartex" xmlns:cx6="http://schemas.microsoft.com/office/drawing/2016/5/12/chartex" xmlns:cx7="http://schemas.microsoft.com/office/drawing/2016/5/13/chartex" xmlns:cx8="http://schemas.microsoft.com/office/drawing/2016/5/14/chartex" xmlns:mc="http://schemas.openxmlformats.org/markup-compatibility/2006" xmlns:aink="http://schemas.microsoft.com/office/drawing/2016/ink" xmlns:am3d="http://schemas.microsoft.com/office/drawing/2017/model3d" xmlns:o="urn:schemas-microsoft-com:office:office" xmlns:oel="http://schemas.microsoft.com/office/2019/extlst" xmlns:r="http://schemas.openxmlformats.org/officeDocument/2006/relationships" xmlns:m="http://schemas.openxmlformats.org/officeDocument/2006/math" xmlns:v="urn:schemas-microsoft-com:vml" xmlns:wp14="http://schemas.microsoft.com/office/word/2010/wordprocessingDrawing" xmlns:wp="http://schemas.openxmlformats.org/drawingml/2006/wordprocessingDrawing" xmlns:w10="urn:schemas-microsoft-com:office:word" xmlns:w="http://schemas.openxmlformats.org/wordprocessingml/2006/main" xmlns:w14="http://schemas.microsoft.com/office/word/2010/wordml" xmlns:w15="http://schemas.microsoft.com/office/word/2012/wordml" xmlns:w16cex="http://schemas.microsoft.com/office/word/2018/wordml/cex" xmlns:w16cid="http://schemas.microsoft.com/office/word/2016/wordml/cid" xmlns:w16="http://schemas.microsoft.com/office/word/2018/wordml" xmlns:w16du="http://schemas.microsoft.com/office/word/2023/wordml/word16du" xmlns:w16sdtdh="http://schemas.microsoft.com/office/word/2020/wordml/sdtdatahash" xmlns:w16sdtfl="http://schemas.microsoft.com/office/word/2024/wordml/sdtformatlock" xmlns:w16se="http://schemas.microsoft.com/office/word/2015/wordml/symex" xmlns:wpg="http://schemas.microsoft.com/office/word/2010/wordprocessingGroup" xmlns:wpi="http://schemas.microsoft.com/office/word/2010/wordprocessingInk" xmlns:wne="http://schemas.microsoft.com/office/word/2006/wordml" xmlns:wps="http://schemas.microsoft.com/office/word/2010/wordprocessingShape" mc:Ignorable="w14 w15 w16se w16cid w16 w16cex w16sdtdh w16sdtfl w16du wp14">
+<w:document xmlns:wpc="http://schemas.microsoft.com/office/word/2010/wordprocessingCanvas" xmlns:cx="http://schemas.microsoft.com/office/drawing/2014/chartex" xmlns:cx1="http://schemas.microsoft.com/office/drawing/2015/9/8/chartex" xmlns:cx2="http://schemas.microsoft.com/office/drawing/2015/10/21/chartex" xmlns:cx3="http://schemas.microsoft.com/office/drawing/2016/5/9/chartex" xmlns:cx4="http://schemas.microsoft.com/office/drawing/2016/5/10/chartex" xmlns:cx5="http://schemas.microsoft.com/office/drawing/2016/5/11/chartex" xmlns:cx6="http://schemas.microsoft.com/office/drawing/2016/5/12/chartex" xmlns:cx7="http://schemas.microsoft.com/office/drawing/2016/5/13/chartex" xmlns:cx8="http://schemas.microsoft.com/office/drawing/2016/5/14/chartex" xmlns:mc="http://schemas.openxmlformats.org/markup-compatibility/2006" xmlns:m="http://schemas.openxmlformats.org/officeDocument/2006/math" xmlns:aink="http://schemas.microsoft.com/office/drawing/2016/ink" xmlns:am3d="http://schemas.microsoft.com/office/drawing/2017/model3d" xmlns:oel="http://schemas.microsoft.com/office/2019/extlst" xmlns:r="http://schemas.openxmlformats.org/officeDocument/2006/relationships" xmlns:wp14="http://schemas.microsoft.com/office/word/2010/wordprocessingDrawing" xmlns:wp="http://schemas.openxmlformats.org/drawingml/2006/wordprocessingDrawing" xmlns:wpg="http://schemas.microsoft.com/office/word/2010/wordprocessingGroup" xmlns:wpi="http://schemas.microsoft.com/office/word/2010/wordprocessingInk" xmlns:wps="http://schemas.microsoft.com/office/word/2010/wordprocessingShape" xmlns:o="urn:schemas-microsoft-com:office:office" xmlns:v="urn:schemas-microsoft-com:vml" xmlns:w10="urn:schemas-microsoft-com:office:word" xmlns:w="http://schemas.openxmlformats.org/wordprocessingml/2006/main" xmlns:w14="http://schemas.microsoft.com/office/word/2010/wordml" xmlns:w15="http://schemas.microsoft.com/office/word/2012/wordml" xmlns:w16cei="http://schemas.microsoft.com/office/word/2026/wordml/cei" xmlns:w16cex="http://schemas.microsoft.com/office/word/2018/wordml/cex" xmlns:w16cid="http://schemas.microsoft.com/office/word/2016/wordml/cid" xmlns:w16="http://schemas.microsoft.com/office/word/2018/wordml" xmlns:w16sdtdh="http://schemas.microsoft.com/office/word/2020/wordml/sdtdatahash" xmlns:w16sdtfl="http://schemas.microsoft.com/office/word/2024/wordml/sdtformatlock" xmlns:w16se="http://schemas.microsoft.com/office/word/2015/wordml/symex" xmlns:w16du="http://schemas.microsoft.com/office/word/2023/wordml/word16du" xmlns:wne="http://schemas.microsoft.com/office/word/2006/wordml" mc:Ignorable="w14 w15 w16se w16cid w16 w16cex w16sdtdh w16sdtfl w16du wp14">
   <w:body>
     <w:p/>
     <w:p/>
@@ -21326,10 +21326,7 @@
         <w:pStyle w:val="Otsikko2"/>
       </w:pPr>
       <w:r>
-        <w:t>Testausstrategia</w:t>
-      </w:r>
-      <w:r>
-        <w:t xml:space="preserve"> </w:t>
+        <w:t xml:space="preserve">Testausstrategia </w:t>
       </w:r>
     </w:p>
     <w:p>
@@ -21353,15 +21350,7 @@
       </w:r>
       <w:proofErr w:type="spellEnd"/>
       <w:r>
-        <w:t xml:space="preserve"> testaus, AI-mallin </w:t>
-      </w:r>
-      <w:proofErr w:type="spellStart"/>
-      <w:r>
-        <w:t>arviointi</w:t>
-      </w:r>
-      <w:proofErr w:type="spellEnd"/>
-      <w:r>
-        <w:t xml:space="preserve"> sekä suorituskykytestausta. </w:t>
+        <w:t xml:space="preserve"> testaus, AI-mallin arviointi sekä suorituskykytestausta. </w:t>
       </w:r>
     </w:p>
     <w:p/>
@@ -21525,6 +21514,11 @@
       <w:bookmarkEnd w:id="36"/>
     </w:p>
     <w:p>
+      <w:r>
+        <w:t>Luvussa käydään läpi ohjelmiston toteutusta, teknologiavalintoja ja perusteluja niille sekä ongelmia mitä ohjelmistoa tehdessä ilmeni. Luvun tarkoituksen on myös kuvata, millaista ohjelmistokehitys oli kehittäjälle kehitysvaiheessa sekä millainen ajatusprosessi oli.</w:t>
+      </w:r>
+    </w:p>
+    <w:p>
       <w:pPr>
         <w:pStyle w:val="Otsikko2"/>
       </w:pPr>
@@ -21535,6 +21529,241 @@
       <w:bookmarkEnd w:id="37"/>
     </w:p>
     <w:p>
+      <w:r>
+        <w:t xml:space="preserve">Teknologiavalinnat olivat alusta alkaen suhteellisen selkeät. </w:t>
+      </w:r>
+      <w:r>
+        <w:t xml:space="preserve">Koko ohjelmisto kehitettiin </w:t>
+      </w:r>
+      <w:proofErr w:type="spellStart"/>
+      <w:r>
+        <w:t>TypeScriptillä</w:t>
+      </w:r>
+      <w:proofErr w:type="spellEnd"/>
+      <w:r>
+        <w:t xml:space="preserve">, joka mahdollistaa sulavaa web kehitystä sekä ennen kaikkea tyypitystä, joka mahdollistaa muun muassa vihreiden havaitsemisen jo kehitysvaiheessa ilman, että nämä virheet päätyvät tuotantoon. Sekä omasta mielestäni </w:t>
+      </w:r>
+      <w:proofErr w:type="spellStart"/>
+      <w:r>
+        <w:t>TypeScript</w:t>
+      </w:r>
+      <w:proofErr w:type="spellEnd"/>
+      <w:r>
+        <w:t xml:space="preserve"> tarjoaa esimerkiksi JavaScriptiin verraten paremman koodin ylläpidettävyyden sekä luettavuuden, mikä on tärkeää laajoissa ohjelmistoissa. </w:t>
+      </w:r>
+    </w:p>
+    <w:p/>
+    <w:p>
+      <w:r>
+        <w:t xml:space="preserve">Ohjelmisto toteutettiin Next.js, Express, Prisma ORM </w:t>
+      </w:r>
+      <w:r>
+        <w:t>pinolla</w:t>
+      </w:r>
+      <w:r>
+        <w:t xml:space="preserve">. Client eli </w:t>
+      </w:r>
+      <w:proofErr w:type="spellStart"/>
+      <w:r>
+        <w:t>frontend</w:t>
+      </w:r>
+      <w:proofErr w:type="spellEnd"/>
+      <w:r>
+        <w:t xml:space="preserve"> puolen viitekehyksenä toimi Next.js, </w:t>
+      </w:r>
+      <w:proofErr w:type="spellStart"/>
+      <w:r>
+        <w:t>server</w:t>
+      </w:r>
+      <w:proofErr w:type="spellEnd"/>
+      <w:r>
+        <w:t xml:space="preserve"> puolen eli </w:t>
+      </w:r>
+      <w:proofErr w:type="spellStart"/>
+      <w:r>
+        <w:t>backend</w:t>
+      </w:r>
+      <w:proofErr w:type="spellEnd"/>
+      <w:r>
+        <w:t xml:space="preserve"> puolen viitekehyksenä oli puolestaan Express, jota ajettiin Node.js ympäristössä ja tietokantana toimi </w:t>
+      </w:r>
+      <w:proofErr w:type="spellStart"/>
+      <w:r>
+        <w:t>Postqre</w:t>
+      </w:r>
+      <w:proofErr w:type="spellEnd"/>
+      <w:r>
+        <w:t xml:space="preserve"> SQL, jota käytettiin Prisma ORM työkalun avulla sen sijaan, että kirjoitettaisiin SQL-syntaksia suoraan tiedostoihin. </w:t>
+      </w:r>
+    </w:p>
+    <w:p/>
+    <w:p>
+      <w:r>
+        <w:t xml:space="preserve">Next.js ja Express olivat loogisia valintoja, koska kyseessä oli kuitenkin web kehityksen projekti sekä molemmat viitekehykset ja niiden ympäristöt käyttivät samaa ohjelmointikieltä. Tietokanta valinta oli myös helppo valinta. </w:t>
+      </w:r>
+      <w:proofErr w:type="spellStart"/>
+      <w:r>
+        <w:t>Postqre</w:t>
+      </w:r>
+      <w:proofErr w:type="spellEnd"/>
+      <w:r>
+        <w:t xml:space="preserve"> SQL toimii erinomaisesti</w:t>
+      </w:r>
+      <w:r>
+        <w:t xml:space="preserve"> relaatiotietokantana sekä siihen valittu Prisma ORM oli erinomainen ratkaisu, sillä se mahdollisti tietokantakyselyjen kirjoittamisen suoraan </w:t>
+      </w:r>
+      <w:proofErr w:type="spellStart"/>
+      <w:r>
+        <w:t>TypeScriptä-syntaxilla</w:t>
+      </w:r>
+      <w:proofErr w:type="spellEnd"/>
+      <w:r>
+        <w:t xml:space="preserve"> ilman SQL:n kirjoittamista tiedostoihin.</w:t>
+      </w:r>
+      <w:r>
+        <w:t xml:space="preserve"> Prisma ORM ohelle valitsin myös </w:t>
+      </w:r>
+      <w:proofErr w:type="spellStart"/>
+      <w:r>
+        <w:t>Supabasen</w:t>
+      </w:r>
+      <w:proofErr w:type="spellEnd"/>
+      <w:r>
+        <w:t xml:space="preserve">. </w:t>
+      </w:r>
+      <w:proofErr w:type="spellStart"/>
+      <w:r>
+        <w:t>Supabasen</w:t>
+      </w:r>
+      <w:proofErr w:type="spellEnd"/>
+      <w:r>
+        <w:t xml:space="preserve"> avulla pysyttiin helposti esimerkkisi muodostamaan JWT </w:t>
+      </w:r>
+      <w:proofErr w:type="spellStart"/>
+      <w:r>
+        <w:t>tokeneita</w:t>
+      </w:r>
+      <w:proofErr w:type="spellEnd"/>
+      <w:r>
+        <w:t xml:space="preserve"> käyttäjien autentikointiin sekä tiedostojen tallentaminen tänne oli erityisten kätevää. </w:t>
+      </w:r>
+    </w:p>
+    <w:p/>
+    <w:p>
+      <w:r>
+        <w:t xml:space="preserve">Testaus kirjastot </w:t>
+      </w:r>
+      <w:r>
+        <w:t xml:space="preserve">mitä projektissa käytettiin, olivat </w:t>
+      </w:r>
+      <w:proofErr w:type="spellStart"/>
+      <w:r>
+        <w:t>Jest</w:t>
+      </w:r>
+      <w:proofErr w:type="spellEnd"/>
+      <w:r>
+        <w:t xml:space="preserve"> </w:t>
+      </w:r>
+      <w:proofErr w:type="spellStart"/>
+      <w:r>
+        <w:t>server</w:t>
+      </w:r>
+      <w:proofErr w:type="spellEnd"/>
+      <w:r>
+        <w:t xml:space="preserve"> puolen </w:t>
+      </w:r>
+      <w:proofErr w:type="spellStart"/>
+      <w:r>
+        <w:t>unit</w:t>
+      </w:r>
+      <w:proofErr w:type="spellEnd"/>
+      <w:r>
+        <w:t xml:space="preserve">- sekä integraatiotestauksiin. </w:t>
+      </w:r>
+      <w:proofErr w:type="spellStart"/>
+      <w:r>
+        <w:t>Cypress</w:t>
+      </w:r>
+      <w:proofErr w:type="spellEnd"/>
+      <w:r>
+        <w:t xml:space="preserve"> testaus kirjasto puolestaan E2E-testeihin, missä simuloitiin </w:t>
+      </w:r>
+      <w:r>
+        <w:lastRenderedPageBreak/>
+        <w:t xml:space="preserve">kokonaisia käyttäjä polkuja esimerkiksi: käyttäjän luonti -&gt; kirjautuminen -&gt; tiedostonlataus. Tekoäly ohjelmointirajapinnoiksi valittiin Google vision API, joka mahdollisti OCR-teknologian. </w:t>
+      </w:r>
+      <w:proofErr w:type="spellStart"/>
+      <w:r>
+        <w:t>OpenAI</w:t>
+      </w:r>
+      <w:proofErr w:type="spellEnd"/>
+      <w:r>
+        <w:t xml:space="preserve"> API, joka puolestaan vastasi OCR:llä eritetyn datan järjestelemisestä ja analysoinnista.</w:t>
+      </w:r>
+    </w:p>
+    <w:p/>
+    <w:p>
+      <w:r>
+        <w:t>Muita kirjastoja ja työkaluja, mitä projektissa käyt</w:t>
+      </w:r>
+      <w:r>
+        <w:t>in</w:t>
+      </w:r>
+      <w:r>
+        <w:t xml:space="preserve"> olivat </w:t>
+      </w:r>
+      <w:proofErr w:type="spellStart"/>
+      <w:r>
+        <w:t>Redis</w:t>
+      </w:r>
+      <w:proofErr w:type="spellEnd"/>
+      <w:r>
+        <w:t xml:space="preserve"> + </w:t>
+      </w:r>
+      <w:proofErr w:type="spellStart"/>
+      <w:r>
+        <w:t>BullMQ</w:t>
+      </w:r>
+      <w:proofErr w:type="spellEnd"/>
+      <w:r>
+        <w:t xml:space="preserve">, </w:t>
+      </w:r>
+      <w:proofErr w:type="spellStart"/>
+      <w:r>
+        <w:t>Stripe</w:t>
+      </w:r>
+      <w:proofErr w:type="spellEnd"/>
+      <w:r>
+        <w:t xml:space="preserve"> maksujärjestelmä, </w:t>
+      </w:r>
+      <w:proofErr w:type="spellStart"/>
+      <w:r>
+        <w:t>Resend</w:t>
+      </w:r>
+      <w:proofErr w:type="spellEnd"/>
+      <w:r>
+        <w:t xml:space="preserve"> sähköpostiviestien lähetykseen, Winston yleiseen </w:t>
+      </w:r>
+      <w:proofErr w:type="spellStart"/>
+      <w:r>
+        <w:t>loggaukseen</w:t>
+      </w:r>
+      <w:proofErr w:type="spellEnd"/>
+      <w:r>
+        <w:t xml:space="preserve"> sekä </w:t>
+      </w:r>
+      <w:proofErr w:type="spellStart"/>
+      <w:r>
+        <w:t>Zod</w:t>
+      </w:r>
+      <w:proofErr w:type="spellEnd"/>
+      <w:r>
+        <w:t xml:space="preserve"> tyypitykseen ja validointiin. </w:t>
+      </w:r>
+    </w:p>
+    <w:p/>
+    <w:p/>
+    <w:p>
       <w:pPr>
         <w:pStyle w:val="Otsikko2"/>
       </w:pPr>
@@ -21545,26 +21774,1766 @@
       <w:bookmarkEnd w:id="38"/>
     </w:p>
     <w:p>
+      <w:r>
+        <w:t xml:space="preserve">Alusta asti oli selkeää, että projektiin tarvittiin kaksi eri tekoälypohjaista ohjelmointirajapintaa. Sovelluksen logiikan idea oli, että käyttäjä lataa tiedoston järjestelmään (kuva tai PDF), OCR-teknologia eli Optical </w:t>
+      </w:r>
+      <w:proofErr w:type="spellStart"/>
+      <w:r>
+        <w:t>Character</w:t>
+      </w:r>
+      <w:proofErr w:type="spellEnd"/>
+      <w:r>
+        <w:t xml:space="preserve"> </w:t>
+      </w:r>
+      <w:proofErr w:type="spellStart"/>
+      <w:r>
+        <w:t>Recognition</w:t>
+      </w:r>
+      <w:proofErr w:type="spellEnd"/>
+      <w:r>
+        <w:t xml:space="preserve"> </w:t>
+      </w:r>
+      <w:r>
+        <w:t xml:space="preserve">tunnistaa kuvastaa merkit, kirjaimet ja numerot ja antaa vastauksena nämä palvelimelle. Mutta, koska kuitit voivat olla muodoltaan hyvin erilaisia toisistaan, ei ole varmuutta, että palautettu vastaus olisi aina muodossa: Myyjän nimi, summa, ALV, jne. Tätä ei myöskään voi </w:t>
+      </w:r>
+      <w:proofErr w:type="spellStart"/>
+      <w:r>
+        <w:t>Regexillä</w:t>
+      </w:r>
+      <w:proofErr w:type="spellEnd"/>
+      <w:r>
+        <w:t xml:space="preserve"> oikeastaan mitenkään voi jäsennellä, koska kuitit voivat olla hyvin erilaisia toisistaan. Ainoa ratkaisu oli syöttää OCR antama data jollekin </w:t>
+      </w:r>
+      <w:proofErr w:type="spellStart"/>
+      <w:r>
+        <w:t>LLM:lle</w:t>
+      </w:r>
+      <w:proofErr w:type="spellEnd"/>
+      <w:r>
+        <w:t xml:space="preserve"> esim. </w:t>
+      </w:r>
+      <w:proofErr w:type="spellStart"/>
+      <w:r>
+        <w:t>OpenAI</w:t>
+      </w:r>
+      <w:proofErr w:type="spellEnd"/>
+      <w:r>
+        <w:t xml:space="preserve"> </w:t>
+      </w:r>
+      <w:proofErr w:type="spellStart"/>
+      <w:r>
+        <w:t>API:lle</w:t>
+      </w:r>
+      <w:proofErr w:type="spellEnd"/>
+      <w:r>
+        <w:t xml:space="preserve">. LLM pystyy hyvällä </w:t>
+      </w:r>
+      <w:proofErr w:type="spellStart"/>
+      <w:r>
+        <w:t>promptilla</w:t>
+      </w:r>
+      <w:proofErr w:type="spellEnd"/>
+      <w:r>
+        <w:t xml:space="preserve"> antamaan datan halutussa muodossa esim. myyjän nimi, summa ja ALV. </w:t>
+      </w:r>
+    </w:p>
+    <w:p/>
+    <w:p>
+      <w:r>
+        <w:t xml:space="preserve">Google Vision API toimi hyvin OCR ratkaisuna, kun taas </w:t>
+      </w:r>
+      <w:proofErr w:type="spellStart"/>
+      <w:r>
+        <w:t>OpenAI</w:t>
+      </w:r>
+      <w:proofErr w:type="spellEnd"/>
+      <w:r>
+        <w:t xml:space="preserve"> API puolestaan toimi hyvin </w:t>
+      </w:r>
+      <w:proofErr w:type="spellStart"/>
+      <w:r>
+        <w:t>LLM:nä</w:t>
+      </w:r>
+      <w:proofErr w:type="spellEnd"/>
+      <w:r>
+        <w:t>. Google Vision API tarjosi kolmen kuukauden ilmaisen kokeilun ja sen antamat ”</w:t>
+      </w:r>
+      <w:proofErr w:type="spellStart"/>
+      <w:r>
+        <w:t>credentialit</w:t>
+      </w:r>
+      <w:proofErr w:type="spellEnd"/>
+      <w:r>
+        <w:t xml:space="preserve">” oli helppo käyttää. </w:t>
+      </w:r>
+      <w:proofErr w:type="spellStart"/>
+      <w:r>
+        <w:t>OpenAI</w:t>
+      </w:r>
+      <w:proofErr w:type="spellEnd"/>
+      <w:r>
+        <w:t xml:space="preserve"> API puolestaan vaati maksun, mutta esim. 5 dollarilla saa pyyntöjä enemmän kuin tarpeeksi. </w:t>
+      </w:r>
+      <w:proofErr w:type="spellStart"/>
+      <w:r>
+        <w:t>OpenAI</w:t>
+      </w:r>
+      <w:proofErr w:type="spellEnd"/>
+      <w:r>
+        <w:t xml:space="preserve"> </w:t>
+      </w:r>
+      <w:proofErr w:type="spellStart"/>
+      <w:r>
+        <w:t>consolen</w:t>
+      </w:r>
+      <w:proofErr w:type="spellEnd"/>
+      <w:r>
+        <w:t xml:space="preserve"> sivuilta myös sai varmistettua, että syötettyä dataa ei käytetä </w:t>
+      </w:r>
+      <w:proofErr w:type="spellStart"/>
+      <w:r>
+        <w:t>LLM:n</w:t>
+      </w:r>
+      <w:proofErr w:type="spellEnd"/>
+      <w:r>
+        <w:t xml:space="preserve"> jatkokoulutukseen, mikä oli GDPR:n kannalta oleellista. </w:t>
+      </w:r>
+    </w:p>
+    <w:p/>
+    <w:p>
+      <w:proofErr w:type="spellStart"/>
+      <w:r>
+        <w:t>OpenAI</w:t>
+      </w:r>
+      <w:proofErr w:type="spellEnd"/>
+      <w:r>
+        <w:t xml:space="preserve"> </w:t>
+      </w:r>
+      <w:proofErr w:type="spellStart"/>
+      <w:r>
+        <w:t>API:</w:t>
+      </w:r>
+      <w:r>
+        <w:t>lle</w:t>
+      </w:r>
+      <w:proofErr w:type="spellEnd"/>
+      <w:r>
+        <w:t xml:space="preserve"> on muodostettu ohjelmistossa kolme eri funktiota, joissa kussakin on yksi </w:t>
+      </w:r>
+      <w:proofErr w:type="spellStart"/>
+      <w:r>
+        <w:t>prompti</w:t>
+      </w:r>
+      <w:proofErr w:type="spellEnd"/>
+      <w:r>
+        <w:t>. Nämä funktiot vastaavat muun muassa kuitti datan parsimisesta, käyttäjän kysymyksiin vastaamisesta sekä chatin ”</w:t>
+      </w:r>
+      <w:proofErr w:type="spellStart"/>
+      <w:r>
+        <w:t>titlen</w:t>
+      </w:r>
+      <w:proofErr w:type="spellEnd"/>
+      <w:r>
+        <w:t xml:space="preserve">” muodostamisesta. Mallina käytetään gpt-4o-mini, koska se on </w:t>
+      </w:r>
+      <w:r>
+        <w:lastRenderedPageBreak/>
+        <w:t xml:space="preserve">erittäin edullinen kustannuksien kannalta sekä olen todennut, että sen antamat vastauksen ovat erittäin tarkkoja. Kuitti datan parsiminen -funktio määrittelee tarkan JSON rakenteen, mitä </w:t>
+      </w:r>
+      <w:proofErr w:type="spellStart"/>
+      <w:r>
+        <w:t>AI:n</w:t>
+      </w:r>
+      <w:proofErr w:type="spellEnd"/>
+      <w:r>
+        <w:t xml:space="preserve"> tulee palauttaa, mikä estää tekoälyn hallusinointia ja oman datan keksimistä. Kategorialista myös injektoidaan funktioon dynaamisesti, jolloin </w:t>
+      </w:r>
+      <w:proofErr w:type="spellStart"/>
+      <w:r>
+        <w:t>AI:n</w:t>
+      </w:r>
+      <w:proofErr w:type="spellEnd"/>
+      <w:r>
+        <w:t xml:space="preserve"> annetaan valita </w:t>
+      </w:r>
+      <w:r>
+        <w:t xml:space="preserve">20 kategorian väliltä sopiva kategoria. Mikäli kuitenkin AI epäonnistuisi valitsemaan validi kategoria niin palataan </w:t>
+      </w:r>
+      <w:proofErr w:type="spellStart"/>
+      <w:r>
+        <w:t>defaulttiin</w:t>
+      </w:r>
+      <w:proofErr w:type="spellEnd"/>
+      <w:r>
+        <w:t xml:space="preserve"> MUU kategoria vaihtoehtoon. </w:t>
+      </w:r>
+      <w:r>
+        <w:t xml:space="preserve">Chatti viestien muodostamisen </w:t>
+      </w:r>
+      <w:r>
+        <w:t>kutsu</w:t>
+      </w:r>
+      <w:r>
+        <w:t xml:space="preserve"> puolestaan </w:t>
+      </w:r>
+      <w:r>
+        <w:t xml:space="preserve">ottaa 20 viestin chat historian osaksi </w:t>
+      </w:r>
+      <w:proofErr w:type="spellStart"/>
+      <w:r>
+        <w:t>promptia</w:t>
+      </w:r>
+      <w:proofErr w:type="spellEnd"/>
+      <w:r>
+        <w:t xml:space="preserve">, jotta AI osaa nähdä kontekstin, mistä käyttäjän kanssa </w:t>
+      </w:r>
+      <w:proofErr w:type="gramStart"/>
+      <w:r>
+        <w:t>ollaan</w:t>
+      </w:r>
+      <w:proofErr w:type="gramEnd"/>
+      <w:r>
+        <w:t xml:space="preserve"> puhuttu.</w:t>
+      </w:r>
+    </w:p>
+    <w:p>
       <w:pPr>
         <w:pStyle w:val="Otsikko2"/>
       </w:pPr>
       <w:bookmarkStart w:id="39" w:name="_Toc230596071"/>
-      <w:r>
-        <w:t>Backend-toteutus</w:t>
+      <w:proofErr w:type="spellStart"/>
+      <w:r>
+        <w:t>Backend</w:t>
+      </w:r>
+      <w:proofErr w:type="spellEnd"/>
+      <w:r>
+        <w:t>-toteutus</w:t>
       </w:r>
       <w:bookmarkEnd w:id="39"/>
     </w:p>
     <w:p>
+      <w:r>
+        <w:t xml:space="preserve">Server puolen eli </w:t>
+      </w:r>
+      <w:proofErr w:type="spellStart"/>
+      <w:r>
+        <w:t>backend</w:t>
+      </w:r>
+      <w:proofErr w:type="spellEnd"/>
+      <w:r>
+        <w:t xml:space="preserve"> puolen sovelluskehykseksi valittiin Express, jota käytettiin Node.js ympäristössä. Expressistä minulla oli aiemmin paljon kokemusta, jota valinta oli erinomainen. Osasin muodostaa organisoidun kokonaisuuden heti alusta alkaen jaotellen </w:t>
+      </w:r>
+      <w:proofErr w:type="spellStart"/>
+      <w:r>
+        <w:t>backendin</w:t>
+      </w:r>
+      <w:proofErr w:type="spellEnd"/>
+      <w:r>
+        <w:t xml:space="preserve"> erilaisiin kokonaisuuksiin kuten </w:t>
+      </w:r>
+      <w:proofErr w:type="spellStart"/>
+      <w:r>
+        <w:t>routteihin</w:t>
+      </w:r>
+      <w:proofErr w:type="spellEnd"/>
+      <w:r>
+        <w:t xml:space="preserve">, </w:t>
+      </w:r>
+      <w:proofErr w:type="spellStart"/>
+      <w:r>
+        <w:t>controllereihin</w:t>
+      </w:r>
+      <w:proofErr w:type="spellEnd"/>
+      <w:r>
+        <w:t xml:space="preserve">, </w:t>
+      </w:r>
+      <w:proofErr w:type="spellStart"/>
+      <w:r>
+        <w:t>serviceihin</w:t>
+      </w:r>
+      <w:proofErr w:type="spellEnd"/>
+      <w:r>
+        <w:t xml:space="preserve">, testeihin, </w:t>
+      </w:r>
+      <w:proofErr w:type="spellStart"/>
+      <w:r>
+        <w:t>middlewareihin</w:t>
+      </w:r>
+      <w:proofErr w:type="spellEnd"/>
+      <w:r>
+        <w:t>, jne.</w:t>
+      </w:r>
+      <w:bookmarkStart w:id="40" w:name="_Toc230596072"/>
+    </w:p>
+    <w:p/>
+    <w:p>
+      <w:r>
+        <w:t>Controllerit sisältävät funktiot, jotka käsittelevät kunkin reitin (</w:t>
+      </w:r>
+      <w:proofErr w:type="spellStart"/>
+      <w:r>
+        <w:t>route</w:t>
+      </w:r>
+      <w:proofErr w:type="spellEnd"/>
+      <w:r>
+        <w:t xml:space="preserve">) pyynnöt ja vastaukset. Nämä funktiot yhdistetään </w:t>
+      </w:r>
+      <w:proofErr w:type="spellStart"/>
+      <w:r>
+        <w:t>Routeriin</w:t>
+      </w:r>
+      <w:proofErr w:type="spellEnd"/>
+      <w:r>
+        <w:t xml:space="preserve"> </w:t>
+      </w:r>
+      <w:proofErr w:type="spellStart"/>
+      <w:r>
+        <w:t>routes</w:t>
+      </w:r>
+      <w:proofErr w:type="spellEnd"/>
+      <w:r>
+        <w:t xml:space="preserve">-tiedostoissa, ja </w:t>
+      </w:r>
+      <w:proofErr w:type="spellStart"/>
+      <w:r>
+        <w:t>Routerit</w:t>
+      </w:r>
+      <w:proofErr w:type="spellEnd"/>
+      <w:r>
+        <w:t xml:space="preserve"> otetaan lopulta käyttöön </w:t>
+      </w:r>
+      <w:proofErr w:type="spellStart"/>
+      <w:r>
+        <w:t>app.ts</w:t>
+      </w:r>
+      <w:proofErr w:type="spellEnd"/>
+      <w:r>
+        <w:t>-tiedostossa.</w:t>
+      </w:r>
+      <w:r>
+        <w:t xml:space="preserve"> Moneen </w:t>
+      </w:r>
+      <w:proofErr w:type="spellStart"/>
+      <w:r>
+        <w:t>routtiin</w:t>
+      </w:r>
+      <w:proofErr w:type="spellEnd"/>
+      <w:r>
+        <w:t xml:space="preserve"> on yhdistetty erilaisia </w:t>
+      </w:r>
+      <w:proofErr w:type="spellStart"/>
+      <w:r>
+        <w:t>middlewareja</w:t>
+      </w:r>
+      <w:proofErr w:type="spellEnd"/>
+      <w:r>
+        <w:t xml:space="preserve">, joista yleisimmät ovat </w:t>
+      </w:r>
+      <w:proofErr w:type="spellStart"/>
+      <w:r>
+        <w:t>autentikaatio</w:t>
+      </w:r>
+      <w:proofErr w:type="spellEnd"/>
+      <w:r>
+        <w:t xml:space="preserve"> sekä ”</w:t>
+      </w:r>
+      <w:proofErr w:type="spellStart"/>
+      <w:r>
+        <w:t>rate</w:t>
+      </w:r>
+      <w:proofErr w:type="spellEnd"/>
+      <w:r>
+        <w:t xml:space="preserve"> </w:t>
+      </w:r>
+      <w:proofErr w:type="spellStart"/>
+      <w:r>
+        <w:t>limiter</w:t>
+      </w:r>
+      <w:proofErr w:type="spellEnd"/>
+      <w:r>
+        <w:t>”</w:t>
+      </w:r>
+      <w:r>
+        <w:t xml:space="preserve">. </w:t>
+      </w:r>
+    </w:p>
+    <w:p/>
+    <w:p>
+      <w:proofErr w:type="spellStart"/>
+      <w:r>
+        <w:t>Autentikaatio</w:t>
+      </w:r>
+      <w:proofErr w:type="spellEnd"/>
+      <w:r>
+        <w:t xml:space="preserve"> perustuu </w:t>
+      </w:r>
+      <w:proofErr w:type="spellStart"/>
+      <w:r>
+        <w:t>Supabasessa</w:t>
+      </w:r>
+      <w:proofErr w:type="spellEnd"/>
+      <w:r>
+        <w:t xml:space="preserve"> muodostettuun JWT-</w:t>
+      </w:r>
+      <w:proofErr w:type="spellStart"/>
+      <w:r>
+        <w:t>autentikointitokeniin</w:t>
+      </w:r>
+      <w:proofErr w:type="spellEnd"/>
+      <w:r>
+        <w:t>. Ohjelmistoon kirjautumisen yhteydessä käyttäjän tietoja vasten luodaan JWT-</w:t>
+      </w:r>
+      <w:proofErr w:type="spellStart"/>
+      <w:r>
+        <w:t>token</w:t>
+      </w:r>
+      <w:proofErr w:type="spellEnd"/>
+      <w:r>
+        <w:t>, joka lähetetään evästeeseen (</w:t>
+      </w:r>
+      <w:proofErr w:type="spellStart"/>
+      <w:r>
+        <w:t>cookie</w:t>
+      </w:r>
+      <w:proofErr w:type="spellEnd"/>
+      <w:r>
+        <w:t xml:space="preserve">). Tämä eväste lähetetään automaattisesti jokaisen pyynnön mukana palvelimelle, jossa </w:t>
+      </w:r>
+      <w:proofErr w:type="spellStart"/>
+      <w:r>
+        <w:t>token</w:t>
+      </w:r>
+      <w:proofErr w:type="spellEnd"/>
+      <w:r>
+        <w:t xml:space="preserve"> validoidaan ja käyttäjän identiteetti varmistetaan ennen kuin pyyntö sallitaan käsiteltäväksi.</w:t>
+      </w:r>
+      <w:r>
+        <w:t xml:space="preserve"> </w:t>
+      </w:r>
+      <w:proofErr w:type="spellStart"/>
+      <w:r>
+        <w:t>Autentikaatio</w:t>
+      </w:r>
+      <w:proofErr w:type="spellEnd"/>
+      <w:r>
+        <w:t xml:space="preserve"> </w:t>
+      </w:r>
+      <w:proofErr w:type="spellStart"/>
+      <w:r>
+        <w:t>middlewarea</w:t>
+      </w:r>
+      <w:proofErr w:type="spellEnd"/>
+      <w:r>
+        <w:t xml:space="preserve"> käytetään lähes kaikissa </w:t>
+      </w:r>
+      <w:proofErr w:type="spellStart"/>
+      <w:r>
+        <w:t>routeissa</w:t>
+      </w:r>
+      <w:proofErr w:type="spellEnd"/>
+      <w:r>
+        <w:t xml:space="preserve"> lukuun ottamatta tietenkin esim. </w:t>
+      </w:r>
+      <w:proofErr w:type="spellStart"/>
+      <w:r>
+        <w:t>signup</w:t>
+      </w:r>
+      <w:proofErr w:type="spellEnd"/>
+      <w:r>
+        <w:t xml:space="preserve">, </w:t>
+      </w:r>
+      <w:proofErr w:type="spellStart"/>
+      <w:r>
+        <w:t>login</w:t>
+      </w:r>
+      <w:proofErr w:type="spellEnd"/>
+      <w:r>
+        <w:t xml:space="preserve"> ja </w:t>
+      </w:r>
+      <w:proofErr w:type="spellStart"/>
+      <w:r>
+        <w:t>password-reset</w:t>
+      </w:r>
+      <w:proofErr w:type="spellEnd"/>
+      <w:r>
+        <w:t xml:space="preserve">. </w:t>
+      </w:r>
+    </w:p>
+    <w:p/>
+    <w:p>
+      <w:proofErr w:type="spellStart"/>
+      <w:r>
+        <w:t>Rate</w:t>
+      </w:r>
+      <w:proofErr w:type="spellEnd"/>
+      <w:r>
+        <w:t xml:space="preserve"> </w:t>
+      </w:r>
+      <w:proofErr w:type="spellStart"/>
+      <w:r>
+        <w:t>limiter</w:t>
+      </w:r>
+      <w:proofErr w:type="spellEnd"/>
+      <w:r>
+        <w:t xml:space="preserve"> </w:t>
+      </w:r>
+      <w:proofErr w:type="spellStart"/>
+      <w:r>
+        <w:t>middlewaren</w:t>
+      </w:r>
+      <w:proofErr w:type="spellEnd"/>
+      <w:r>
+        <w:t xml:space="preserve"> idea on puolestaan rajoittaa yksittäisen käyttäjän pyyntöjen määrä, joka estää jossain määrin palvelimen ylikuormitusta sekä </w:t>
+      </w:r>
+      <w:proofErr w:type="spellStart"/>
+      <w:r>
+        <w:t>Ddos</w:t>
+      </w:r>
+      <w:proofErr w:type="spellEnd"/>
+      <w:r>
+        <w:t xml:space="preserve"> hyökkäyksiä. </w:t>
+      </w:r>
+      <w:proofErr w:type="spellStart"/>
+      <w:r>
+        <w:t>Rate</w:t>
+      </w:r>
+      <w:proofErr w:type="spellEnd"/>
+      <w:r>
+        <w:t xml:space="preserve"> </w:t>
+      </w:r>
+      <w:proofErr w:type="spellStart"/>
+      <w:r>
+        <w:t>limiter</w:t>
+      </w:r>
+      <w:proofErr w:type="spellEnd"/>
+      <w:r>
+        <w:t xml:space="preserve"> perustuu joko käyttäjän </w:t>
+      </w:r>
+      <w:proofErr w:type="spellStart"/>
+      <w:r>
+        <w:t>ID:hen</w:t>
+      </w:r>
+      <w:proofErr w:type="spellEnd"/>
+      <w:r>
+        <w:t xml:space="preserve"> tai IP-osoitteeseen. Kaikki </w:t>
+      </w:r>
+      <w:proofErr w:type="spellStart"/>
+      <w:r>
+        <w:t>routit</w:t>
+      </w:r>
+      <w:proofErr w:type="spellEnd"/>
+      <w:r>
+        <w:t xml:space="preserve">, joissa käyttäjä on jo kirjautunut, </w:t>
+      </w:r>
+      <w:r>
+        <w:lastRenderedPageBreak/>
+        <w:t xml:space="preserve">voidaan hyvin käyttää </w:t>
+      </w:r>
+      <w:proofErr w:type="spellStart"/>
+      <w:r>
+        <w:t>user_id:tä</w:t>
+      </w:r>
+      <w:proofErr w:type="spellEnd"/>
+      <w:r>
+        <w:t xml:space="preserve">, mutta puolestaan </w:t>
+      </w:r>
+      <w:proofErr w:type="spellStart"/>
+      <w:r>
+        <w:t>routit</w:t>
+      </w:r>
+      <w:proofErr w:type="spellEnd"/>
+      <w:r>
+        <w:t xml:space="preserve"> kuten </w:t>
+      </w:r>
+      <w:proofErr w:type="spellStart"/>
+      <w:r>
+        <w:t>login</w:t>
+      </w:r>
+      <w:proofErr w:type="spellEnd"/>
+      <w:r>
+        <w:t xml:space="preserve"> ja </w:t>
+      </w:r>
+      <w:proofErr w:type="spellStart"/>
+      <w:r>
+        <w:t>signup</w:t>
+      </w:r>
+      <w:proofErr w:type="spellEnd"/>
+      <w:r>
+        <w:t xml:space="preserve"> suojataan IP-osoitteeseen kohdistuvan rajoittimen avulla. </w:t>
+      </w:r>
+      <w:proofErr w:type="spellStart"/>
+      <w:r>
+        <w:t>Rate</w:t>
+      </w:r>
+      <w:proofErr w:type="spellEnd"/>
+      <w:r>
+        <w:t xml:space="preserve"> </w:t>
+      </w:r>
+      <w:proofErr w:type="spellStart"/>
+      <w:r>
+        <w:t>limiterin</w:t>
+      </w:r>
+      <w:proofErr w:type="spellEnd"/>
+      <w:r>
+        <w:t xml:space="preserve"> ideana on, että jokaiselle </w:t>
+      </w:r>
+      <w:proofErr w:type="spellStart"/>
+      <w:r>
+        <w:t>routelle</w:t>
+      </w:r>
+      <w:proofErr w:type="spellEnd"/>
+      <w:r>
+        <w:t xml:space="preserve"> tulee oma </w:t>
+      </w:r>
+      <w:proofErr w:type="spellStart"/>
+      <w:r>
+        <w:t>rate</w:t>
+      </w:r>
+      <w:proofErr w:type="spellEnd"/>
+      <w:r>
+        <w:t xml:space="preserve"> </w:t>
+      </w:r>
+      <w:proofErr w:type="spellStart"/>
+      <w:r>
+        <w:t>limiter</w:t>
+      </w:r>
+      <w:proofErr w:type="spellEnd"/>
+      <w:r>
+        <w:t xml:space="preserve"> ”</w:t>
+      </w:r>
+      <w:proofErr w:type="spellStart"/>
+      <w:r>
+        <w:t>bucket</w:t>
+      </w:r>
+      <w:proofErr w:type="spellEnd"/>
+      <w:r>
+        <w:t xml:space="preserve">” jossa on tietty määrä pyyntöjä, mitä minuutissa saa tehdä. Tämän rajan ylittyessä tulee </w:t>
+      </w:r>
+      <w:r>
+        <w:t>lukitus</w:t>
+      </w:r>
+      <w:r>
+        <w:t xml:space="preserve">, jossa käyttäjälle ilmoitetaan, eikä hän voi </w:t>
+      </w:r>
+      <w:r>
+        <w:t>lukituksen</w:t>
+      </w:r>
+      <w:r>
+        <w:t xml:space="preserve"> aikana tehdä pyyntöjä </w:t>
+      </w:r>
+      <w:r>
+        <w:rPr>
+          <w:b/>
+          <w:bCs/>
+        </w:rPr>
+        <w:t>tähän</w:t>
+      </w:r>
+      <w:r>
+        <w:t xml:space="preserve"> osoitteeseen. </w:t>
+      </w:r>
+      <w:proofErr w:type="spellStart"/>
+      <w:r>
+        <w:t>Rate</w:t>
+      </w:r>
+      <w:proofErr w:type="spellEnd"/>
+      <w:r>
+        <w:t xml:space="preserve"> </w:t>
+      </w:r>
+      <w:proofErr w:type="spellStart"/>
+      <w:r>
+        <w:t>limitereitä</w:t>
+      </w:r>
+      <w:proofErr w:type="spellEnd"/>
+      <w:r>
+        <w:t xml:space="preserve"> on ohjelmistossa käytännössä useampi kuin yksi. Esimerkiksi raskaammat operaatiot kuten tiedoston </w:t>
+      </w:r>
+      <w:proofErr w:type="spellStart"/>
+      <w:r>
+        <w:t>upload</w:t>
+      </w:r>
+      <w:proofErr w:type="spellEnd"/>
+      <w:r>
+        <w:t xml:space="preserve"> käyttävät eri </w:t>
+      </w:r>
+      <w:proofErr w:type="spellStart"/>
+      <w:r>
+        <w:t>rate</w:t>
+      </w:r>
+      <w:proofErr w:type="spellEnd"/>
+      <w:r>
+        <w:t xml:space="preserve"> </w:t>
+      </w:r>
+      <w:proofErr w:type="spellStart"/>
+      <w:r>
+        <w:t>limiteriä</w:t>
+      </w:r>
+      <w:proofErr w:type="spellEnd"/>
+      <w:r>
+        <w:t xml:space="preserve"> kuin useammat </w:t>
+      </w:r>
+      <w:r>
+        <w:t>GET</w:t>
+      </w:r>
+      <w:r>
+        <w:t xml:space="preserve"> </w:t>
+      </w:r>
+      <w:proofErr w:type="spellStart"/>
+      <w:r>
+        <w:t>routit</w:t>
+      </w:r>
+      <w:proofErr w:type="spellEnd"/>
+      <w:r>
+        <w:t xml:space="preserve">. Raskaammissa operaatioissa on vähemmän sallittuja pyyntöjä per minuutti ja </w:t>
+      </w:r>
+      <w:proofErr w:type="spellStart"/>
+      <w:r>
+        <w:t>rate</w:t>
+      </w:r>
+      <w:proofErr w:type="spellEnd"/>
+      <w:r>
+        <w:t xml:space="preserve"> </w:t>
+      </w:r>
+      <w:proofErr w:type="spellStart"/>
+      <w:r>
+        <w:t>limiterit</w:t>
+      </w:r>
+      <w:proofErr w:type="spellEnd"/>
+      <w:r>
+        <w:t xml:space="preserve"> on jaoteltu esim. </w:t>
+      </w:r>
+      <w:proofErr w:type="spellStart"/>
+      <w:r>
+        <w:t>rate_</w:t>
+      </w:r>
+      <w:proofErr w:type="gramStart"/>
+      <w:r>
+        <w:t>limiter.read</w:t>
+      </w:r>
+      <w:proofErr w:type="spellEnd"/>
+      <w:proofErr w:type="gramEnd"/>
+      <w:r>
+        <w:t>()</w:t>
+      </w:r>
+      <w:r>
+        <w:t xml:space="preserve">, </w:t>
+      </w:r>
+      <w:proofErr w:type="spellStart"/>
+      <w:r>
+        <w:t>rate_</w:t>
+      </w:r>
+      <w:proofErr w:type="gramStart"/>
+      <w:r>
+        <w:t>limiter.write</w:t>
+      </w:r>
+      <w:proofErr w:type="spellEnd"/>
+      <w:proofErr w:type="gramEnd"/>
+      <w:r>
+        <w:t>()</w:t>
+      </w:r>
+      <w:r>
+        <w:t xml:space="preserve">, </w:t>
+      </w:r>
+      <w:proofErr w:type="spellStart"/>
+      <w:r>
+        <w:t>rate_</w:t>
+      </w:r>
+      <w:proofErr w:type="gramStart"/>
+      <w:r>
+        <w:t>limiter.heavy</w:t>
+      </w:r>
+      <w:proofErr w:type="gramEnd"/>
+      <w:r>
+        <w:t>_</w:t>
+      </w:r>
+      <w:proofErr w:type="gramStart"/>
+      <w:r>
+        <w:t>read</w:t>
+      </w:r>
+      <w:proofErr w:type="spellEnd"/>
+      <w:r>
+        <w:t>(</w:t>
+      </w:r>
+      <w:proofErr w:type="gramEnd"/>
+      <w:r>
+        <w:t>)</w:t>
+      </w:r>
+      <w:r>
+        <w:t xml:space="preserve">, </w:t>
+      </w:r>
+      <w:proofErr w:type="spellStart"/>
+      <w:r>
+        <w:t>rate_</w:t>
+      </w:r>
+      <w:proofErr w:type="gramStart"/>
+      <w:r>
+        <w:t>limiter.heavy</w:t>
+      </w:r>
+      <w:proofErr w:type="gramEnd"/>
+      <w:r>
+        <w:t>_</w:t>
+      </w:r>
+      <w:proofErr w:type="gramStart"/>
+      <w:r>
+        <w:t>write</w:t>
+      </w:r>
+      <w:proofErr w:type="spellEnd"/>
+      <w:r>
+        <w:t xml:space="preserve">()  </w:t>
+      </w:r>
+      <w:r>
+        <w:t>tyyliin</w:t>
+      </w:r>
+      <w:proofErr w:type="gramEnd"/>
+      <w:r>
+        <w:t xml:space="preserve">, jossa sulkeisiin syötetään vielä </w:t>
+      </w:r>
+      <w:proofErr w:type="spellStart"/>
+      <w:r>
+        <w:t>bucketin</w:t>
+      </w:r>
+      <w:proofErr w:type="spellEnd"/>
+      <w:r>
+        <w:t xml:space="preserve"> nimi</w:t>
+      </w:r>
+      <w:r>
+        <w:t>.</w:t>
+      </w:r>
+    </w:p>
+    <w:p/>
+    <w:p>
+      <w:r>
+        <w:t xml:space="preserve">Tiedostojen käsittely on toteutettu asynkronisesti </w:t>
+      </w:r>
+      <w:proofErr w:type="spellStart"/>
+      <w:r>
+        <w:t>BullMQ</w:t>
+      </w:r>
+      <w:proofErr w:type="spellEnd"/>
+      <w:r>
+        <w:t xml:space="preserve">-jonon avulla, joka käyttää Redistä taustajärjestelmänä. Kun käyttäjä lataa kuitin, tiedosto tallennetaan välittömästi </w:t>
+      </w:r>
+      <w:proofErr w:type="spellStart"/>
+      <w:r>
+        <w:t>Supabase</w:t>
+      </w:r>
+      <w:proofErr w:type="spellEnd"/>
+      <w:r>
+        <w:t xml:space="preserve">-tallennustilaan ja tietokantaan luodaan dokumenttitietue tilalla PENDING. Tämän jälkeen </w:t>
+      </w:r>
+      <w:proofErr w:type="spellStart"/>
+      <w:r>
+        <w:t>käsittelyjob</w:t>
+      </w:r>
+      <w:proofErr w:type="spellEnd"/>
+      <w:r>
+        <w:t xml:space="preserve"> lisätään jonoon, ja API vastaa käyttäjälle välittömästi ilman, että sen tarvitsee odottaa kuitin analysointia.</w:t>
+      </w:r>
+    </w:p>
+    <w:p/>
+    <w:p>
+      <w:r>
+        <w:t xml:space="preserve">Erillinen </w:t>
+      </w:r>
+      <w:proofErr w:type="spellStart"/>
+      <w:r>
+        <w:t>worker</w:t>
+      </w:r>
+      <w:proofErr w:type="spellEnd"/>
+      <w:r>
+        <w:t xml:space="preserve">-prosessi lukee jonosta jobeja ja käsittelee ne yksi kerrallaan. </w:t>
+      </w:r>
+      <w:proofErr w:type="spellStart"/>
+      <w:r>
+        <w:t>Worker</w:t>
+      </w:r>
+      <w:proofErr w:type="spellEnd"/>
+      <w:r>
+        <w:t xml:space="preserve"> lataa tiedoston </w:t>
+      </w:r>
+      <w:proofErr w:type="spellStart"/>
+      <w:r>
+        <w:t>Supabasesta</w:t>
+      </w:r>
+      <w:proofErr w:type="spellEnd"/>
+      <w:r>
+        <w:t xml:space="preserve">, analysoi sen Google Vision OCR:llä tekstiksi, jonka jälkeen </w:t>
+      </w:r>
+      <w:proofErr w:type="spellStart"/>
+      <w:r>
+        <w:t>OpenAI</w:t>
+      </w:r>
+      <w:proofErr w:type="spellEnd"/>
+      <w:r>
+        <w:t xml:space="preserve"> jäsentää tekstistä strukturoidun datan</w:t>
+      </w:r>
+      <w:r>
+        <w:t>,</w:t>
+      </w:r>
+      <w:r>
+        <w:t xml:space="preserve"> </w:t>
+      </w:r>
+      <w:r>
+        <w:t>myyjän</w:t>
+      </w:r>
+      <w:r>
+        <w:t xml:space="preserve"> nimen, päivämäärän, summan, ALV-erittelyn sekä kategorian. Onnistuneen käsittelyn jälkeen dokumentin tila päivitetään COMPLETED-tilaan ja kuittitiedot tallennetaan tietokantaan.</w:t>
+      </w:r>
+    </w:p>
+    <w:p/>
+    <w:p>
+      <w:r>
+        <w:t xml:space="preserve">Jonon käyttämisen etuna on se, että raskas käsittely ei blokkaa HTTP-pyyntöä. </w:t>
+      </w:r>
+      <w:r>
+        <w:t xml:space="preserve">Eli AI analysointi toimii käytännössä ns. taustaprosessina, jossa käyttäjä voi tehdä muutakin ohjelmistossa, sillä välin, kun analysointi on meneillään. </w:t>
+      </w:r>
+      <w:r>
+        <w:t xml:space="preserve">Jos käsittely epäonnistuu esimerkiksi API-virheen takia, </w:t>
+      </w:r>
+      <w:proofErr w:type="spellStart"/>
+      <w:r>
+        <w:t>BullMQ</w:t>
+      </w:r>
+      <w:proofErr w:type="spellEnd"/>
+      <w:r>
+        <w:t xml:space="preserve"> yrittää jobin uudelleen automaattisesti eksponentiaalisella viiveellä. Käyttäjä voi seurata käsittelyn tilaa erillisen status-</w:t>
+      </w:r>
+      <w:proofErr w:type="spellStart"/>
+      <w:r>
+        <w:t>endpointin</w:t>
+      </w:r>
+      <w:proofErr w:type="spellEnd"/>
+      <w:r>
+        <w:t xml:space="preserve"> kautta, johon </w:t>
+      </w:r>
+      <w:proofErr w:type="spellStart"/>
+      <w:r>
+        <w:t>frontend</w:t>
+      </w:r>
+      <w:proofErr w:type="spellEnd"/>
+      <w:r>
+        <w:t xml:space="preserve"> tekee pollauksia.</w:t>
+      </w:r>
+      <w:r>
+        <w:t xml:space="preserve"> Pollauksia tehdään myös kuittien haku sivuilla, mikäli joku kuitti sisältää PENDING tilan ja kuitit näytetään käyttäjälle reaaliaikaan niiden analysoitua. Kun yksikään dokumentti ei sisällä PENDING tilaa </w:t>
+      </w:r>
+      <w:proofErr w:type="spellStart"/>
+      <w:r>
+        <w:t>pollaus</w:t>
+      </w:r>
+      <w:proofErr w:type="spellEnd"/>
+      <w:r>
+        <w:t xml:space="preserve"> lopetetaan.</w:t>
+      </w:r>
+    </w:p>
+    <w:p/>
+    <w:p>
+      <w:r>
+        <w:t xml:space="preserve">Ohjelmistossa toimii </w:t>
+      </w:r>
+      <w:proofErr w:type="spellStart"/>
+      <w:r>
+        <w:t>Stripe</w:t>
+      </w:r>
+      <w:proofErr w:type="spellEnd"/>
+      <w:r>
+        <w:t xml:space="preserve"> maksujärjestelmä. </w:t>
+      </w:r>
+      <w:proofErr w:type="spellStart"/>
+      <w:r>
+        <w:t>Stripe</w:t>
+      </w:r>
+      <w:proofErr w:type="spellEnd"/>
+      <w:r>
+        <w:t xml:space="preserve"> on konfiguroitu </w:t>
+      </w:r>
+      <w:r>
+        <w:t xml:space="preserve">ottamaan vastaan vuosittaisia ja kuukausittaisia </w:t>
+      </w:r>
+      <w:proofErr w:type="spellStart"/>
+      <w:r>
+        <w:t>basic</w:t>
+      </w:r>
+      <w:proofErr w:type="spellEnd"/>
+      <w:r>
+        <w:t xml:space="preserve"> ja </w:t>
+      </w:r>
+      <w:proofErr w:type="spellStart"/>
+      <w:r>
+        <w:t>premium</w:t>
+      </w:r>
+      <w:proofErr w:type="spellEnd"/>
+      <w:r>
+        <w:t xml:space="preserve"> tilauksia. Ohjelmistossa luotu </w:t>
+      </w:r>
+      <w:proofErr w:type="spellStart"/>
+      <w:r>
+        <w:t>checkout</w:t>
+      </w:r>
+      <w:proofErr w:type="spellEnd"/>
+      <w:r>
+        <w:t xml:space="preserve"> </w:t>
+      </w:r>
+      <w:proofErr w:type="spellStart"/>
+      <w:r>
+        <w:t>flow</w:t>
+      </w:r>
+      <w:proofErr w:type="spellEnd"/>
+      <w:r>
+        <w:t xml:space="preserve"> toimii periaatteessa näin: </w:t>
+      </w:r>
+      <w:r>
+        <w:t xml:space="preserve">Kun käyttäjä valitsee tilauksen, luodaan </w:t>
+      </w:r>
+      <w:proofErr w:type="spellStart"/>
+      <w:r>
+        <w:t>Stripe</w:t>
+      </w:r>
+      <w:proofErr w:type="spellEnd"/>
+      <w:r>
+        <w:t xml:space="preserve"> </w:t>
+      </w:r>
+      <w:proofErr w:type="spellStart"/>
+      <w:r>
+        <w:t>Checkout</w:t>
+      </w:r>
+      <w:proofErr w:type="spellEnd"/>
+      <w:r>
+        <w:t xml:space="preserve"> -</w:t>
+      </w:r>
+      <w:proofErr w:type="gramStart"/>
+      <w:r>
+        <w:t>sessio</w:t>
+      </w:r>
+      <w:proofErr w:type="gramEnd"/>
+      <w:r>
+        <w:t xml:space="preserve"> jossa määritellään hinta, onnistumis- ja peruutus-URL sekä metadata (</w:t>
+      </w:r>
+      <w:proofErr w:type="spellStart"/>
+      <w:r>
+        <w:t>user_id</w:t>
+      </w:r>
+      <w:proofErr w:type="spellEnd"/>
+      <w:r>
+        <w:t xml:space="preserve">, </w:t>
+      </w:r>
+      <w:proofErr w:type="spellStart"/>
+      <w:r>
+        <w:t>subscriptionType</w:t>
+      </w:r>
+      <w:proofErr w:type="spellEnd"/>
+      <w:r>
+        <w:t xml:space="preserve">). Käyttäjä ohjataan </w:t>
+      </w:r>
+      <w:proofErr w:type="spellStart"/>
+      <w:r>
+        <w:t>Stripen</w:t>
+      </w:r>
+      <w:proofErr w:type="spellEnd"/>
+      <w:r>
+        <w:t xml:space="preserve"> omalle maksusivulle, jolloin sovellus ei itse käsittele maksukorttitietoja.</w:t>
+      </w:r>
+      <w:r>
+        <w:t xml:space="preserve"> Ohjelmistossa on myös </w:t>
+      </w:r>
+      <w:proofErr w:type="spellStart"/>
+      <w:r>
+        <w:t>webhook</w:t>
+      </w:r>
+      <w:proofErr w:type="spellEnd"/>
+      <w:r>
+        <w:t xml:space="preserve"> pohjainen tilauksen hallinta, joka kuuntelee </w:t>
+      </w:r>
+      <w:proofErr w:type="spellStart"/>
+      <w:r>
+        <w:t>stripe</w:t>
+      </w:r>
+      <w:proofErr w:type="spellEnd"/>
+      <w:r>
+        <w:t xml:space="preserve"> pyyntöjä ja tekee sitä mukaa tilauksia, </w:t>
+      </w:r>
+      <w:proofErr w:type="spellStart"/>
+      <w:r>
+        <w:t>peruutuuksia</w:t>
+      </w:r>
+      <w:proofErr w:type="spellEnd"/>
+      <w:r>
+        <w:t xml:space="preserve"> ja peruutuksen perumisia. </w:t>
+      </w:r>
+    </w:p>
+    <w:p/>
+    <w:p>
+      <w:r>
+        <w:t xml:space="preserve">Tilauksen tila ei päivity suoraan </w:t>
+      </w:r>
+      <w:proofErr w:type="spellStart"/>
+      <w:r>
+        <w:t>checkoutin</w:t>
+      </w:r>
+      <w:proofErr w:type="spellEnd"/>
+      <w:r>
+        <w:t xml:space="preserve"> jälkeen vaan </w:t>
+      </w:r>
+      <w:proofErr w:type="spellStart"/>
+      <w:r>
+        <w:t>Stripe</w:t>
+      </w:r>
+      <w:proofErr w:type="spellEnd"/>
+      <w:r>
+        <w:t xml:space="preserve"> lähettää </w:t>
+      </w:r>
+      <w:proofErr w:type="spellStart"/>
+      <w:r>
+        <w:t>webhook</w:t>
+      </w:r>
+      <w:proofErr w:type="spellEnd"/>
+      <w:r>
+        <w:t>-tapahtumia palvelimelle eri tilanteissa</w:t>
+      </w:r>
+      <w:r>
+        <w:t xml:space="preserve">, </w:t>
+      </w:r>
+      <w:r>
+        <w:t xml:space="preserve">esimerkiksi </w:t>
+      </w:r>
+      <w:proofErr w:type="spellStart"/>
+      <w:proofErr w:type="gramStart"/>
+      <w:r>
+        <w:t>checkout.session</w:t>
+      </w:r>
+      <w:proofErr w:type="gramEnd"/>
+      <w:r>
+        <w:t>.completed</w:t>
+      </w:r>
+      <w:proofErr w:type="spellEnd"/>
+      <w:r>
+        <w:t xml:space="preserve">, </w:t>
+      </w:r>
+      <w:proofErr w:type="spellStart"/>
+      <w:proofErr w:type="gramStart"/>
+      <w:r>
+        <w:t>invoice.payment</w:t>
+      </w:r>
+      <w:proofErr w:type="gramEnd"/>
+      <w:r>
+        <w:t>_succeeded</w:t>
+      </w:r>
+      <w:proofErr w:type="spellEnd"/>
+      <w:r>
+        <w:t xml:space="preserve">, </w:t>
+      </w:r>
+      <w:proofErr w:type="spellStart"/>
+      <w:proofErr w:type="gramStart"/>
+      <w:r>
+        <w:t>customer.subscription</w:t>
+      </w:r>
+      <w:proofErr w:type="gramEnd"/>
+      <w:r>
+        <w:t>.deleted</w:t>
+      </w:r>
+      <w:proofErr w:type="spellEnd"/>
+      <w:r>
+        <w:t xml:space="preserve"> ja </w:t>
+      </w:r>
+      <w:proofErr w:type="spellStart"/>
+      <w:proofErr w:type="gramStart"/>
+      <w:r>
+        <w:t>customer.subscription</w:t>
+      </w:r>
+      <w:proofErr w:type="gramEnd"/>
+      <w:r>
+        <w:t>.updated</w:t>
+      </w:r>
+      <w:proofErr w:type="spellEnd"/>
+      <w:r>
+        <w:t xml:space="preserve">. Palvelin käsittelee nämä tapahtumat ja päivittää tietokantaan tilauksen tilan vastaavasti. Tämä on luotettavampi tapa kuin luottaa pelkkään </w:t>
+      </w:r>
+      <w:proofErr w:type="spellStart"/>
+      <w:r>
+        <w:t>redirect-URLiin</w:t>
+      </w:r>
+      <w:proofErr w:type="spellEnd"/>
+      <w:r>
+        <w:t xml:space="preserve">, koska </w:t>
+      </w:r>
+      <w:proofErr w:type="spellStart"/>
+      <w:r>
+        <w:t>webhook</w:t>
+      </w:r>
+      <w:proofErr w:type="spellEnd"/>
+      <w:r>
+        <w:t xml:space="preserve"> tulee aina </w:t>
+      </w:r>
+      <w:proofErr w:type="spellStart"/>
+      <w:r>
+        <w:t>Stripeltä</w:t>
+      </w:r>
+      <w:proofErr w:type="spellEnd"/>
+      <w:r>
+        <w:t xml:space="preserve"> riippumatta siitä sulkeeko käyttäjä selaimen kesken maksun.</w:t>
+      </w:r>
+    </w:p>
+    <w:p/>
+    <w:p>
+      <w:r>
+        <w:t xml:space="preserve">Testauksessa käytetään </w:t>
+      </w:r>
+      <w:proofErr w:type="spellStart"/>
+      <w:r>
+        <w:t>backend</w:t>
+      </w:r>
+      <w:proofErr w:type="spellEnd"/>
+      <w:r>
+        <w:t xml:space="preserve"> puolella </w:t>
+      </w:r>
+      <w:proofErr w:type="spellStart"/>
+      <w:r>
+        <w:t>Jestiä</w:t>
+      </w:r>
+      <w:proofErr w:type="spellEnd"/>
+      <w:r>
+        <w:t xml:space="preserve"> </w:t>
+      </w:r>
+      <w:proofErr w:type="spellStart"/>
+      <w:r>
+        <w:t>unit</w:t>
+      </w:r>
+      <w:proofErr w:type="spellEnd"/>
+      <w:r>
+        <w:t xml:space="preserve">- ja integraatiotestaukseen. </w:t>
+      </w:r>
+      <w:proofErr w:type="spellStart"/>
+      <w:r>
+        <w:t>Jestin</w:t>
+      </w:r>
+      <w:proofErr w:type="spellEnd"/>
+      <w:r>
+        <w:t xml:space="preserve"> avulla on muodostettu 180 testiä yhteensä, joka kattaa kaikki ohjelmiston kontrollerit ja </w:t>
+      </w:r>
+      <w:proofErr w:type="spellStart"/>
+      <w:r>
+        <w:t>serviceiden</w:t>
+      </w:r>
+      <w:proofErr w:type="spellEnd"/>
+      <w:r>
+        <w:t xml:space="preserve"> </w:t>
+      </w:r>
+      <w:r>
+        <w:t>(Open AI, OCR, jne.)</w:t>
+      </w:r>
+      <w:r>
+        <w:t xml:space="preserve"> ja </w:t>
+      </w:r>
+      <w:proofErr w:type="spellStart"/>
+      <w:r>
+        <w:t>middlewarejen</w:t>
+      </w:r>
+      <w:proofErr w:type="spellEnd"/>
+      <w:r>
+        <w:t xml:space="preserve"> </w:t>
+      </w:r>
+      <w:proofErr w:type="spellStart"/>
+      <w:r>
+        <w:t>unit</w:t>
+      </w:r>
+      <w:proofErr w:type="spellEnd"/>
+      <w:r>
+        <w:t xml:space="preserve"> testit.</w:t>
+      </w:r>
+      <w:r>
+        <w:t xml:space="preserve"> Testeissä saavutettiin testikattavuudeksi 89.54 %, lausekattavuudeksi 75.4 % ja haarakattavuudeksi 90.35 %. </w:t>
+      </w:r>
+      <w:r>
+        <w:t xml:space="preserve">Ulkoiset riippuvuudet, kuten tietokantakutsut, </w:t>
+      </w:r>
+      <w:proofErr w:type="spellStart"/>
+      <w:r>
+        <w:t>Stripe</w:t>
+      </w:r>
+      <w:proofErr w:type="spellEnd"/>
+      <w:r>
+        <w:t xml:space="preserve"> ja </w:t>
+      </w:r>
+      <w:proofErr w:type="spellStart"/>
+      <w:r>
+        <w:t>Supabase</w:t>
+      </w:r>
+      <w:proofErr w:type="spellEnd"/>
+      <w:r>
+        <w:t xml:space="preserve">, on korvattu testeissä </w:t>
+      </w:r>
+      <w:proofErr w:type="spellStart"/>
+      <w:r>
+        <w:t>mock</w:t>
+      </w:r>
+      <w:proofErr w:type="spellEnd"/>
+      <w:r>
+        <w:t>-objekteilla, jolloin testit ovat nopeita ja eivät vaadi verkkoyhteyttä.</w:t>
+      </w:r>
+      <w:r>
+        <w:t xml:space="preserve"> Testit </w:t>
+      </w:r>
+      <w:r>
+        <w:t>ajetaan</w:t>
+      </w:r>
+      <w:r>
+        <w:t xml:space="preserve"> myös</w:t>
+      </w:r>
+      <w:r>
+        <w:t xml:space="preserve"> erillisessä </w:t>
+      </w:r>
+      <w:proofErr w:type="spellStart"/>
+      <w:r>
+        <w:t>Docker</w:t>
+      </w:r>
+      <w:proofErr w:type="spellEnd"/>
+      <w:r>
+        <w:t>-testiympäristössä, jossa on oma PostgreSQL-tietokanta, jolloin testit eivät vaikuta tuotanto- tai kehitysympäristön dataan.</w:t>
+      </w:r>
+    </w:p>
+    <w:p>
       <w:pPr>
         <w:pStyle w:val="Otsikko2"/>
       </w:pPr>
-      <w:bookmarkStart w:id="40" w:name="_Toc230596072"/>
-      <w:r>
-        <w:t>Frontend-toteutus</w:t>
+      <w:proofErr w:type="spellStart"/>
+      <w:r>
+        <w:t>Frontend</w:t>
+      </w:r>
+      <w:proofErr w:type="spellEnd"/>
+      <w:r>
+        <w:t>-toteutus</w:t>
       </w:r>
       <w:bookmarkEnd w:id="40"/>
     </w:p>
     <w:p>
+      <w:r>
+        <w:t>Sovelluskehykseksi</w:t>
+      </w:r>
+      <w:r>
+        <w:t xml:space="preserve"> eli ”</w:t>
+      </w:r>
+      <w:proofErr w:type="spellStart"/>
+      <w:r>
+        <w:t>frameworkiksi</w:t>
+      </w:r>
+      <w:proofErr w:type="spellEnd"/>
+      <w:r>
+        <w:t xml:space="preserve">” valittiin </w:t>
+      </w:r>
+      <w:proofErr w:type="spellStart"/>
+      <w:r>
+        <w:t>frontend</w:t>
+      </w:r>
+      <w:proofErr w:type="spellEnd"/>
+      <w:r>
+        <w:t xml:space="preserve"> puolella Next.js. Next.js viitekehyksenä oli hieman tuntematon itselleni projektin alkuvaiheessa. </w:t>
+      </w:r>
+      <w:proofErr w:type="spellStart"/>
+      <w:r>
+        <w:t>Reactia</w:t>
+      </w:r>
+      <w:proofErr w:type="spellEnd"/>
+      <w:r>
+        <w:t xml:space="preserve"> olen käyttänyt useisiin projekteihin kuitenkin, niin oppimiskaari oli suhteellisen nopea. Mikä teki </w:t>
+      </w:r>
+      <w:proofErr w:type="spellStart"/>
+      <w:r>
+        <w:t>Next.js:stä</w:t>
+      </w:r>
+      <w:proofErr w:type="spellEnd"/>
+      <w:r>
+        <w:t xml:space="preserve"> erityistä oli sen ominaisuus käyttää </w:t>
+      </w:r>
+      <w:proofErr w:type="spellStart"/>
+      <w:r>
+        <w:t>server</w:t>
+      </w:r>
+      <w:proofErr w:type="spellEnd"/>
+      <w:r>
+        <w:t xml:space="preserve">-komponentteja, </w:t>
+      </w:r>
+      <w:proofErr w:type="spellStart"/>
+      <w:r>
+        <w:t>server</w:t>
+      </w:r>
+      <w:proofErr w:type="spellEnd"/>
+      <w:r>
+        <w:t xml:space="preserve"> action tiedostoja sekä </w:t>
+      </w:r>
+      <w:proofErr w:type="spellStart"/>
+      <w:r>
+        <w:t>client</w:t>
+      </w:r>
+      <w:proofErr w:type="spellEnd"/>
+      <w:r>
+        <w:t xml:space="preserve"> </w:t>
+      </w:r>
+      <w:r>
+        <w:lastRenderedPageBreak/>
+        <w:t xml:space="preserve">komponentteja. Se miten itse ymmärsin esimerkiksi </w:t>
+      </w:r>
+      <w:proofErr w:type="spellStart"/>
+      <w:r>
+        <w:t>server</w:t>
+      </w:r>
+      <w:proofErr w:type="spellEnd"/>
+      <w:r>
+        <w:t xml:space="preserve">-komponentin ja </w:t>
+      </w:r>
+      <w:proofErr w:type="spellStart"/>
+      <w:r>
+        <w:t>client</w:t>
+      </w:r>
+      <w:proofErr w:type="spellEnd"/>
+      <w:r>
+        <w:t xml:space="preserve"> komponentin eron </w:t>
+      </w:r>
+      <w:proofErr w:type="spellStart"/>
+      <w:r>
+        <w:t>Next.js:ssä</w:t>
+      </w:r>
+      <w:proofErr w:type="spellEnd"/>
+      <w:r>
+        <w:t xml:space="preserve"> oli, että </w:t>
+      </w:r>
+      <w:proofErr w:type="spellStart"/>
+      <w:r>
+        <w:t>server</w:t>
+      </w:r>
+      <w:proofErr w:type="spellEnd"/>
+      <w:r>
+        <w:t>-komponentti renderöidään valmiiksi jo palvelimella eikä se lähetä komponentin omaa JS-koodia selaimelle, mikä tarkoittaa pienempää ”</w:t>
+      </w:r>
+      <w:proofErr w:type="spellStart"/>
+      <w:r>
+        <w:t>bundlekokoa</w:t>
+      </w:r>
+      <w:proofErr w:type="spellEnd"/>
+      <w:r>
+        <w:t xml:space="preserve">” eli toisin sanoen kevyempää komponenttia. Server komponentissa puolestaan ei ole mahdollista käyttää </w:t>
+      </w:r>
+      <w:proofErr w:type="spellStart"/>
+      <w:r>
+        <w:t>Reactille</w:t>
+      </w:r>
+      <w:proofErr w:type="spellEnd"/>
+      <w:r>
+        <w:t xml:space="preserve"> tuttuja </w:t>
+      </w:r>
+      <w:proofErr w:type="spellStart"/>
+      <w:r>
+        <w:t>useState</w:t>
+      </w:r>
+      <w:proofErr w:type="spellEnd"/>
+      <w:r>
+        <w:t xml:space="preserve">, </w:t>
+      </w:r>
+      <w:proofErr w:type="spellStart"/>
+      <w:r>
+        <w:t>useEffect</w:t>
+      </w:r>
+      <w:proofErr w:type="spellEnd"/>
+      <w:r>
+        <w:t xml:space="preserve">, </w:t>
+      </w:r>
+      <w:proofErr w:type="spellStart"/>
+      <w:r>
+        <w:t>useRef</w:t>
+      </w:r>
+      <w:proofErr w:type="spellEnd"/>
+      <w:r>
+        <w:t xml:space="preserve">, yms. vastaavia toimintoja. Datan haku esimerkiksi palvelimelta on puolestaan kätevää. Voidaan suoraan asettaa komponentti asynkroniseksi ja tehdä ja hakea käytännössä yhdellä rivillä data suoraan muuttujaan </w:t>
+      </w:r>
+      <w:proofErr w:type="spellStart"/>
+      <w:r>
+        <w:t>await</w:t>
+      </w:r>
+      <w:proofErr w:type="spellEnd"/>
+      <w:r>
+        <w:t xml:space="preserve"> avainsanalla sen sijaan että pitäisi käyttää </w:t>
+      </w:r>
+      <w:proofErr w:type="spellStart"/>
+      <w:r>
+        <w:t>useEffect-hookkia</w:t>
+      </w:r>
+      <w:proofErr w:type="spellEnd"/>
+      <w:r>
+        <w:t xml:space="preserve">. </w:t>
+      </w:r>
+    </w:p>
+    <w:p/>
+    <w:p>
+      <w:r>
+        <w:t>Client komponentin saa puolestaan muodostettua käyttämällä ’</w:t>
+      </w:r>
+      <w:proofErr w:type="spellStart"/>
+      <w:r>
+        <w:t>use-client</w:t>
+      </w:r>
+      <w:proofErr w:type="spellEnd"/>
+      <w:r>
+        <w:t xml:space="preserve">’ merkkijonoa tiedostossa. Client komponentti mahdollistaa puolestaan sen, että komponentti lähettää JS-koodin selaimelle. Client komponentissa ensin renderöidään HTML ja sitten ”herätetään HTML eloon” selaimessa lisäämällä interaktiivisuutta sivuun esimerkiksi edellä mainituilla </w:t>
+      </w:r>
+      <w:proofErr w:type="spellStart"/>
+      <w:r>
+        <w:t>useState</w:t>
+      </w:r>
+      <w:proofErr w:type="spellEnd"/>
+      <w:r>
+        <w:t xml:space="preserve">, </w:t>
+      </w:r>
+      <w:proofErr w:type="spellStart"/>
+      <w:r>
+        <w:t>useEffect</w:t>
+      </w:r>
+      <w:proofErr w:type="spellEnd"/>
+      <w:r>
+        <w:t xml:space="preserve"> tai </w:t>
+      </w:r>
+      <w:proofErr w:type="spellStart"/>
+      <w:r>
+        <w:t>useRef</w:t>
+      </w:r>
+      <w:proofErr w:type="spellEnd"/>
+      <w:r>
+        <w:t xml:space="preserve"> toiminnoilla. Jokaista komponenttia ei kuitenkaan automaattisesti voi leimata ”</w:t>
+      </w:r>
+      <w:proofErr w:type="spellStart"/>
+      <w:r>
+        <w:t>use-client</w:t>
+      </w:r>
+      <w:proofErr w:type="spellEnd"/>
+      <w:r>
+        <w:t xml:space="preserve">” merkkijonolla sillä, </w:t>
+      </w:r>
+      <w:proofErr w:type="spellStart"/>
+      <w:r>
+        <w:t>client</w:t>
+      </w:r>
+      <w:proofErr w:type="spellEnd"/>
+      <w:r>
+        <w:t xml:space="preserve"> komponentit ovat raskaampia, koska ne kasvattavat lähetettävän </w:t>
+      </w:r>
+      <w:proofErr w:type="spellStart"/>
+      <w:r>
+        <w:t>JavaScripti-bundlen</w:t>
+      </w:r>
+      <w:proofErr w:type="spellEnd"/>
+      <w:r>
+        <w:t xml:space="preserve"> kokoa ja vaatii ”</w:t>
+      </w:r>
+      <w:proofErr w:type="spellStart"/>
+      <w:r>
+        <w:t>hydratoinnin</w:t>
+      </w:r>
+      <w:proofErr w:type="spellEnd"/>
+      <w:r>
+        <w:t xml:space="preserve">”, mikä lisää selaimen suoritustaakkaa verrattuna </w:t>
+      </w:r>
+      <w:proofErr w:type="spellStart"/>
+      <w:r>
+        <w:t>server</w:t>
+      </w:r>
+      <w:proofErr w:type="spellEnd"/>
+      <w:r>
+        <w:t xml:space="preserve"> komponentteihin. Tässä tuleekin tilanne, jossa joutui tarkkaan miettimään sivun ja ohjelmiston arkkitehtuuria. Mitkä komponentit oltava </w:t>
+      </w:r>
+      <w:proofErr w:type="spellStart"/>
+      <w:r>
+        <w:t>client</w:t>
+      </w:r>
+      <w:proofErr w:type="spellEnd"/>
+      <w:r>
+        <w:t xml:space="preserve">-komponentteja ja mitkä taas </w:t>
+      </w:r>
+      <w:proofErr w:type="spellStart"/>
+      <w:r>
+        <w:t>server-komponetteja</w:t>
+      </w:r>
+      <w:proofErr w:type="spellEnd"/>
+      <w:r>
+        <w:t>. Myös täytyi muistaa, että jos ”</w:t>
+      </w:r>
+      <w:proofErr w:type="spellStart"/>
+      <w:r>
+        <w:t>parent</w:t>
+      </w:r>
+      <w:proofErr w:type="spellEnd"/>
+      <w:r>
+        <w:t xml:space="preserve"> komponentti” on </w:t>
+      </w:r>
+      <w:proofErr w:type="spellStart"/>
+      <w:r>
+        <w:t>client</w:t>
+      </w:r>
+      <w:proofErr w:type="spellEnd"/>
+      <w:r>
+        <w:t xml:space="preserve">-komponentti, niin sen </w:t>
+      </w:r>
+      <w:proofErr w:type="spellStart"/>
+      <w:r>
+        <w:t>child</w:t>
+      </w:r>
+      <w:proofErr w:type="spellEnd"/>
+      <w:r>
+        <w:t xml:space="preserve"> komponentti on myös aina </w:t>
+      </w:r>
+      <w:proofErr w:type="spellStart"/>
+      <w:r>
+        <w:t>client</w:t>
+      </w:r>
+      <w:proofErr w:type="spellEnd"/>
+      <w:r>
+        <w:t xml:space="preserve">-komponentti. Eli miettien tätä hierarkiaa, </w:t>
+      </w:r>
+      <w:proofErr w:type="spellStart"/>
+      <w:r>
+        <w:t>server</w:t>
+      </w:r>
+      <w:proofErr w:type="spellEnd"/>
+      <w:r>
+        <w:t xml:space="preserve">-komponenttien on oltava ylempänä hierarkiassa puussa. </w:t>
+      </w:r>
+    </w:p>
+    <w:p/>
+    <w:p>
+      <w:r>
+        <w:t>Next.js oli myös rakenteeltaan erittäin looginen ja kaikki tiedostot ja komponentit pysyivät järkevästi organisoituina. (main) kansion sisään tulivat suurin osa sovelluksen reiteistä (/</w:t>
+      </w:r>
+      <w:proofErr w:type="spellStart"/>
+      <w:r>
+        <w:t>upload</w:t>
+      </w:r>
+      <w:proofErr w:type="spellEnd"/>
+      <w:r>
+        <w:t>, /</w:t>
+      </w:r>
+      <w:proofErr w:type="spellStart"/>
+      <w:r>
+        <w:t>dashboard</w:t>
+      </w:r>
+      <w:proofErr w:type="spellEnd"/>
+      <w:r>
+        <w:t>, /</w:t>
+      </w:r>
+      <w:proofErr w:type="spellStart"/>
+      <w:r>
+        <w:t>receipts</w:t>
+      </w:r>
+      <w:proofErr w:type="spellEnd"/>
+      <w:r>
+        <w:t>, tms.). Yksi pääsivu koostuu aina yhdestä kansiosta kuten /</w:t>
+      </w:r>
+      <w:proofErr w:type="spellStart"/>
+      <w:r>
+        <w:t>receipts</w:t>
+      </w:r>
+      <w:proofErr w:type="spellEnd"/>
+      <w:r>
+        <w:t xml:space="preserve">. Kansion sai aina organisoidusti jaoteltua </w:t>
+      </w:r>
+      <w:proofErr w:type="spellStart"/>
+      <w:r>
+        <w:t>Page.tsx</w:t>
+      </w:r>
+      <w:proofErr w:type="spellEnd"/>
+      <w:r>
+        <w:t xml:space="preserve">, komponentteihin sekä </w:t>
+      </w:r>
+      <w:proofErr w:type="spellStart"/>
+      <w:r>
+        <w:t>action.ts</w:t>
+      </w:r>
+      <w:proofErr w:type="spellEnd"/>
+      <w:r>
+        <w:t xml:space="preserve"> tiedostoihin. </w:t>
+      </w:r>
+      <w:proofErr w:type="spellStart"/>
+      <w:r>
+        <w:t>Page.tsx</w:t>
+      </w:r>
+      <w:proofErr w:type="spellEnd"/>
+      <w:r>
+        <w:t xml:space="preserve"> on käytännössä se reitin ydinosa sekä tässä ”hierarkia puussa” se ylin komponentti. Yleensä muodostetaan </w:t>
+      </w:r>
+      <w:proofErr w:type="spellStart"/>
+      <w:r>
+        <w:t>server</w:t>
+      </w:r>
+      <w:proofErr w:type="spellEnd"/>
+      <w:r>
+        <w:t xml:space="preserve"> komponenttina ja </w:t>
+      </w:r>
+      <w:proofErr w:type="spellStart"/>
+      <w:r>
+        <w:t>importataan</w:t>
+      </w:r>
+      <w:proofErr w:type="spellEnd"/>
+      <w:r>
+        <w:t xml:space="preserve"> mahdolliset kentät palvelimelta ja tietokannasta antaen nämä ”propseina” </w:t>
+      </w:r>
+      <w:proofErr w:type="spellStart"/>
+      <w:r>
+        <w:t>child</w:t>
+      </w:r>
+      <w:proofErr w:type="spellEnd"/>
+      <w:r>
+        <w:t xml:space="preserve"> komponenteille. </w:t>
+      </w:r>
+      <w:proofErr w:type="spellStart"/>
+      <w:r>
+        <w:t>Action.ts</w:t>
+      </w:r>
+      <w:proofErr w:type="spellEnd"/>
+      <w:r>
+        <w:t xml:space="preserve"> tiedostot sisältävät puolestaan kaikki </w:t>
+      </w:r>
+      <w:proofErr w:type="spellStart"/>
+      <w:r>
+        <w:t>backend</w:t>
+      </w:r>
+      <w:proofErr w:type="spellEnd"/>
+      <w:r>
+        <w:t xml:space="preserve"> ”</w:t>
+      </w:r>
+      <w:proofErr w:type="spellStart"/>
+      <w:r>
+        <w:t>fetch</w:t>
+      </w:r>
+      <w:proofErr w:type="spellEnd"/>
+      <w:r>
+        <w:t xml:space="preserve"> pyynnöt”, joissa tehdään http-metodeilla eli GET, POST, PUT ja DELETE pyyntöjä </w:t>
+      </w:r>
+      <w:proofErr w:type="spellStart"/>
+      <w:r>
+        <w:t>backendin</w:t>
+      </w:r>
+      <w:proofErr w:type="spellEnd"/>
+      <w:r>
+        <w:t xml:space="preserve"> </w:t>
+      </w:r>
+      <w:proofErr w:type="spellStart"/>
+      <w:r>
+        <w:t>routteihin</w:t>
+      </w:r>
+      <w:proofErr w:type="spellEnd"/>
+      <w:r>
+        <w:t xml:space="preserve">. </w:t>
+      </w:r>
+      <w:proofErr w:type="spellStart"/>
+      <w:r>
+        <w:t>Action.ts</w:t>
+      </w:r>
+      <w:proofErr w:type="spellEnd"/>
+      <w:r>
+        <w:t xml:space="preserve"> tiedostoissa funktiot säilyvät organisoituina sekä </w:t>
+      </w:r>
+      <w:r>
+        <w:lastRenderedPageBreak/>
+        <w:t>mahdollistaa myös niiden uudelleenkäytön ohjelmistossa sen sijaan, että ne olisi suoraan toteutettu komponentteihin.</w:t>
+      </w:r>
+    </w:p>
+    <w:p>
       <w:pPr>
         <w:pStyle w:val="Otsikko2"/>
       </w:pPr>
@@ -21574,6 +23543,235 @@
       </w:r>
       <w:bookmarkEnd w:id="41"/>
     </w:p>
+    <w:p>
+      <w:r>
+        <w:t xml:space="preserve">Kehityshaasteita </w:t>
+      </w:r>
+      <w:proofErr w:type="spellStart"/>
+      <w:r>
+        <w:t>devatessa</w:t>
+      </w:r>
+      <w:proofErr w:type="spellEnd"/>
+      <w:r>
+        <w:t xml:space="preserve"> tuli paljon, koska se on osa kehitysprosessia.</w:t>
+      </w:r>
+      <w:r>
+        <w:t xml:space="preserve"> </w:t>
+      </w:r>
+      <w:r>
+        <w:t>Yksi merkittävimmistä teknisistä haasteista oli kuittianalysoinnin asynkroninen toteutus. Alun perin</w:t>
+      </w:r>
+      <w:r>
+        <w:t xml:space="preserve"> ajattelin toteuttaa</w:t>
+      </w:r>
+      <w:r>
+        <w:t xml:space="preserve"> </w:t>
+      </w:r>
+      <w:r>
+        <w:t>analysoinnin</w:t>
+      </w:r>
+      <w:r>
+        <w:t xml:space="preserve"> suoraan HTTP-pyynnön sisällä, mutta tämä </w:t>
+      </w:r>
+      <w:r>
+        <w:t xml:space="preserve">olisi </w:t>
+      </w:r>
+      <w:r>
+        <w:t>aiheutt</w:t>
+      </w:r>
+      <w:r>
+        <w:t>anut</w:t>
+      </w:r>
+      <w:r>
+        <w:t xml:space="preserve"> ongelmia pitkien vasteaikojen ja aikakatkaisujen muodossa, sillä Google Vision OCR ja</w:t>
+      </w:r>
+      <w:r>
+        <w:t xml:space="preserve"> etenkin</w:t>
+      </w:r>
+      <w:r>
+        <w:t xml:space="preserve"> </w:t>
+      </w:r>
+      <w:proofErr w:type="spellStart"/>
+      <w:r>
+        <w:t>OpenAI</w:t>
+      </w:r>
+      <w:proofErr w:type="spellEnd"/>
+      <w:r>
+        <w:t xml:space="preserve">-kutsut voivat kestää useita sekunteja. Ratkaisuna otettiin käyttöön </w:t>
+      </w:r>
+      <w:proofErr w:type="spellStart"/>
+      <w:r>
+        <w:t>BullMQ</w:t>
+      </w:r>
+      <w:proofErr w:type="spellEnd"/>
+      <w:r>
+        <w:t xml:space="preserve">-jono Redistä taustajärjestelmänä, jolloin analysointi siirrettiin erilliselle </w:t>
+      </w:r>
+      <w:proofErr w:type="spellStart"/>
+      <w:r>
+        <w:t>worker</w:t>
+      </w:r>
+      <w:proofErr w:type="spellEnd"/>
+      <w:r>
+        <w:t xml:space="preserve">-prosessille. Tämä mahdollisti välittömän vastauksen käyttäjälle ja teki järjestelmästä huomattavasti luotettavamman, sillä epäonnistuneet </w:t>
+      </w:r>
+      <w:proofErr w:type="spellStart"/>
+      <w:r>
+        <w:t>jobat</w:t>
+      </w:r>
+      <w:proofErr w:type="spellEnd"/>
+      <w:r>
+        <w:t xml:space="preserve"> yritetään automaattisesti uudelleen.</w:t>
+      </w:r>
+    </w:p>
+    <w:p/>
+    <w:p>
+      <w:r>
+        <w:t>Tekoälyassistentin vastausten suoratoisto (</w:t>
+      </w:r>
+      <w:proofErr w:type="spellStart"/>
+      <w:r>
+        <w:t>streaming</w:t>
+      </w:r>
+      <w:proofErr w:type="spellEnd"/>
+      <w:r>
+        <w:t xml:space="preserve">) osoittautui haastavaksi toteuttaa. Tavallinen </w:t>
+      </w:r>
+      <w:proofErr w:type="spellStart"/>
+      <w:r>
+        <w:t>request-response</w:t>
+      </w:r>
+      <w:proofErr w:type="spellEnd"/>
+      <w:r>
+        <w:t xml:space="preserve"> -malli ei sovellu tilanteeseen, jossa palvelimen pitää lähettää dataa jatkuvana virtana asiakkaalle. Ratkaisuna käytettiin Server-</w:t>
+      </w:r>
+      <w:proofErr w:type="spellStart"/>
+      <w:r>
+        <w:t>Sent</w:t>
+      </w:r>
+      <w:proofErr w:type="spellEnd"/>
+      <w:r>
+        <w:t xml:space="preserve"> </w:t>
+      </w:r>
+      <w:proofErr w:type="spellStart"/>
+      <w:r>
+        <w:t>Events</w:t>
+      </w:r>
+      <w:proofErr w:type="spellEnd"/>
+      <w:r>
+        <w:t xml:space="preserve"> -tekniikkaa, jossa palvelin pitää HTTP-yhteyden auki ja lähettää jokaisen </w:t>
+      </w:r>
+      <w:proofErr w:type="spellStart"/>
+      <w:r>
+        <w:t>OpenAI:lta</w:t>
+      </w:r>
+      <w:proofErr w:type="spellEnd"/>
+      <w:r>
+        <w:t xml:space="preserve"> saapuvan tekstikappaleen välittömästi selaimelle. Tämä loi käyttäjälle luontevan kokemuksen, jossa vastaus ilmestyy ruudulle sana kerrallaan.</w:t>
+      </w:r>
+    </w:p>
+    <w:p/>
+    <w:p>
+      <w:r>
+        <w:t xml:space="preserve">Kirjanpitosovellus käsittelee arkaluonteista taloudellista dataa, joten tietosuojavaatimusten selvittäminen oli aikaa vievää. Erityisen haastavaa oli selvittää </w:t>
+      </w:r>
+      <w:proofErr w:type="spellStart"/>
+      <w:r>
+        <w:t>OpenAI:n</w:t>
+      </w:r>
+      <w:proofErr w:type="spellEnd"/>
+      <w:r>
+        <w:t xml:space="preserve"> datan käsittelykäytännöt ja se, täyttääkö palvelu GDPR:n vaatimukset eurooppalaisten käyttäjien osalta. Tietosuojaselosteen ja käyttöehtojen kirjoittaminen ilman juridista asiantuntemusta oli vaativaa, ja nämä dokumentit vaatisivat jatkossa lakimiehen tarkistuksen.</w:t>
+      </w:r>
+    </w:p>
+    <w:p/>
+    <w:p>
+      <w:r>
+        <w:t xml:space="preserve">Projekti osoittautui </w:t>
+      </w:r>
+      <w:r>
+        <w:t>suhteellisen</w:t>
+      </w:r>
+      <w:r>
+        <w:t xml:space="preserve"> laajaksi yhdelle kehittäjälle. Full-</w:t>
+      </w:r>
+      <w:proofErr w:type="spellStart"/>
+      <w:r>
+        <w:t>stack</w:t>
+      </w:r>
+      <w:proofErr w:type="spellEnd"/>
+      <w:r>
+        <w:t xml:space="preserve"> sovelluksen rakentaminen sisältäen </w:t>
+      </w:r>
+      <w:proofErr w:type="spellStart"/>
+      <w:r>
+        <w:t>frontendin</w:t>
+      </w:r>
+      <w:proofErr w:type="spellEnd"/>
+      <w:r>
+        <w:t xml:space="preserve">, </w:t>
+      </w:r>
+      <w:proofErr w:type="spellStart"/>
+      <w:r>
+        <w:t>backendin</w:t>
+      </w:r>
+      <w:proofErr w:type="spellEnd"/>
+      <w:r>
+        <w:t xml:space="preserve">, tietokannan, ulkoiset integraatiot, testauksen, tietoturvan ja dokumentaation vaati jatkuvaa priorisointia. </w:t>
+      </w:r>
+      <w:r>
+        <w:t xml:space="preserve">Tähän ei selkeää ratkaisua ollut vaan se vaati pitkäjänteisyyttä ja ennen kaikkea ajan priorisointia, jotta projektin sai tehtyä deadlinen </w:t>
+      </w:r>
+      <w:r>
+        <w:lastRenderedPageBreak/>
+        <w:t>mukaisesti. K</w:t>
+      </w:r>
+      <w:r>
+        <w:t>äy</w:t>
+      </w:r>
+      <w:r>
+        <w:t>ti</w:t>
+      </w:r>
+      <w:r>
+        <w:t>n</w:t>
+      </w:r>
+      <w:r>
+        <w:t xml:space="preserve"> </w:t>
+      </w:r>
+      <w:proofErr w:type="spellStart"/>
+      <w:r>
+        <w:t>myös</w:t>
+      </w:r>
+      <w:proofErr w:type="spellEnd"/>
+      <w:r>
+        <w:t xml:space="preserve"> iteratiivista kehitysprosessia GitHub </w:t>
+      </w:r>
+      <w:proofErr w:type="spellStart"/>
+      <w:r>
+        <w:t>Issueiden</w:t>
+      </w:r>
+      <w:proofErr w:type="spellEnd"/>
+      <w:r>
+        <w:t xml:space="preserve"> ja sprinttien avulla, jolloin kehitys eteni hallitusti ominaisuus kerrallaan.</w:t>
+      </w:r>
+    </w:p>
+    <w:p>
+      <w:pPr>
+        <w:pStyle w:val="Otsikko2"/>
+      </w:pPr>
+      <w:r>
+        <w:t>GDPR</w:t>
+      </w:r>
+    </w:p>
+    <w:p>
+      <w:pPr>
+        <w:pStyle w:val="Otsikko2"/>
+      </w:pPr>
+      <w:r>
+        <w:t>OWASP Top 10, Audit tulokset sekä haavoittuvuudet</w:t>
+      </w:r>
+    </w:p>
+    <w:p/>
     <w:p>
       <w:pPr>
         <w:tabs>
@@ -22348,7 +24546,7 @@
 </file>
 
 <file path=word/endnotes.xml><?xml version="1.0" encoding="utf-8"?>
-<w:endnotes xmlns:wpc="http://schemas.microsoft.com/office/word/2010/wordprocessingCanvas" xmlns:cx="http://schemas.microsoft.com/office/drawing/2014/chartex" xmlns:cx1="http://schemas.microsoft.com/office/drawing/2015/9/8/chartex" xmlns:cx2="http://schemas.microsoft.com/office/drawing/2015/10/21/chartex" xmlns:cx3="http://schemas.microsoft.com/office/drawing/2016/5/9/chartex" xmlns:cx4="http://schemas.microsoft.com/office/drawing/2016/5/10/chartex" xmlns:cx5="http://schemas.microsoft.com/office/drawing/2016/5/11/chartex" xmlns:cx6="http://schemas.microsoft.com/office/drawing/2016/5/12/chartex" xmlns:cx7="http://schemas.microsoft.com/office/drawing/2016/5/13/chartex" xmlns:cx8="http://schemas.microsoft.com/office/drawing/2016/5/14/chartex" xmlns:mc="http://schemas.openxmlformats.org/markup-compatibility/2006" xmlns:aink="http://schemas.microsoft.com/office/drawing/2016/ink" xmlns:am3d="http://schemas.microsoft.com/office/drawing/2017/model3d" xmlns:o="urn:schemas-microsoft-com:office:office" xmlns:oel="http://schemas.microsoft.com/office/2019/extlst" xmlns:r="http://schemas.openxmlformats.org/officeDocument/2006/relationships" xmlns:m="http://schemas.openxmlformats.org/officeDocument/2006/math" xmlns:v="urn:schemas-microsoft-com:vml" xmlns:wp14="http://schemas.microsoft.com/office/word/2010/wordprocessingDrawing" xmlns:wp="http://schemas.openxmlformats.org/drawingml/2006/wordprocessingDrawing" xmlns:w10="urn:schemas-microsoft-com:office:word" xmlns:w="http://schemas.openxmlformats.org/wordprocessingml/2006/main" xmlns:w14="http://schemas.microsoft.com/office/word/2010/wordml" xmlns:w15="http://schemas.microsoft.com/office/word/2012/wordml" xmlns:w16cex="http://schemas.microsoft.com/office/word/2018/wordml/cex" xmlns:w16cid="http://schemas.microsoft.com/office/word/2016/wordml/cid" xmlns:w16="http://schemas.microsoft.com/office/word/2018/wordml" xmlns:w16du="http://schemas.microsoft.com/office/word/2023/wordml/word16du" xmlns:w16sdtdh="http://schemas.microsoft.com/office/word/2020/wordml/sdtdatahash" xmlns:w16sdtfl="http://schemas.microsoft.com/office/word/2024/wordml/sdtformatlock" xmlns:w16se="http://schemas.microsoft.com/office/word/2015/wordml/symex" xmlns:wpg="http://schemas.microsoft.com/office/word/2010/wordprocessingGroup" xmlns:wpi="http://schemas.microsoft.com/office/word/2010/wordprocessingInk" xmlns:wne="http://schemas.microsoft.com/office/word/2006/wordml" xmlns:wps="http://schemas.microsoft.com/office/word/2010/wordprocessingShape" mc:Ignorable="w14 w15 w16se w16cid w16 w16cex w16sdtdh w16sdtfl w16du wp14">
+<w:endnotes xmlns:wpc="http://schemas.microsoft.com/office/word/2010/wordprocessingCanvas" xmlns:cx="http://schemas.microsoft.com/office/drawing/2014/chartex" xmlns:cx1="http://schemas.microsoft.com/office/drawing/2015/9/8/chartex" xmlns:cx2="http://schemas.microsoft.com/office/drawing/2015/10/21/chartex" xmlns:cx3="http://schemas.microsoft.com/office/drawing/2016/5/9/chartex" xmlns:cx4="http://schemas.microsoft.com/office/drawing/2016/5/10/chartex" xmlns:cx5="http://schemas.microsoft.com/office/drawing/2016/5/11/chartex" xmlns:cx6="http://schemas.microsoft.com/office/drawing/2016/5/12/chartex" xmlns:cx7="http://schemas.microsoft.com/office/drawing/2016/5/13/chartex" xmlns:cx8="http://schemas.microsoft.com/office/drawing/2016/5/14/chartex" xmlns:mc="http://schemas.openxmlformats.org/markup-compatibility/2006" xmlns:m="http://schemas.openxmlformats.org/officeDocument/2006/math" xmlns:aink="http://schemas.microsoft.com/office/drawing/2016/ink" xmlns:am3d="http://schemas.microsoft.com/office/drawing/2017/model3d" xmlns:oel="http://schemas.microsoft.com/office/2019/extlst" xmlns:r="http://schemas.openxmlformats.org/officeDocument/2006/relationships" xmlns:wp14="http://schemas.microsoft.com/office/word/2010/wordprocessingDrawing" xmlns:wp="http://schemas.openxmlformats.org/drawingml/2006/wordprocessingDrawing" xmlns:wpg="http://schemas.microsoft.com/office/word/2010/wordprocessingGroup" xmlns:wpi="http://schemas.microsoft.com/office/word/2010/wordprocessingInk" xmlns:wps="http://schemas.microsoft.com/office/word/2010/wordprocessingShape" xmlns:o="urn:schemas-microsoft-com:office:office" xmlns:v="urn:schemas-microsoft-com:vml" xmlns:w10="urn:schemas-microsoft-com:office:word" xmlns:w="http://schemas.openxmlformats.org/wordprocessingml/2006/main" xmlns:w14="http://schemas.microsoft.com/office/word/2010/wordml" xmlns:w15="http://schemas.microsoft.com/office/word/2012/wordml" xmlns:w16cei="http://schemas.microsoft.com/office/word/2026/wordml/cei" xmlns:w16cex="http://schemas.microsoft.com/office/word/2018/wordml/cex" xmlns:w16cid="http://schemas.microsoft.com/office/word/2016/wordml/cid" xmlns:w16="http://schemas.microsoft.com/office/word/2018/wordml" xmlns:w16sdtdh="http://schemas.microsoft.com/office/word/2020/wordml/sdtdatahash" xmlns:w16sdtfl="http://schemas.microsoft.com/office/word/2024/wordml/sdtformatlock" xmlns:w16se="http://schemas.microsoft.com/office/word/2015/wordml/symex" xmlns:w16du="http://schemas.microsoft.com/office/word/2023/wordml/word16du" xmlns:wne="http://schemas.microsoft.com/office/word/2006/wordml" mc:Ignorable="w14 w15 w16se w16cid w16 w16cex w16sdtdh w16sdtfl w16du wp14">
   <w:endnote w:type="separator" w:id="-1">
     <w:p>
       <w:pPr>
@@ -22373,7 +24571,7 @@
 </file>
 
 <file path=word/footnotes.xml><?xml version="1.0" encoding="utf-8"?>
-<w:footnotes xmlns:wpc="http://schemas.microsoft.com/office/word/2010/wordprocessingCanvas" xmlns:cx="http://schemas.microsoft.com/office/drawing/2014/chartex" xmlns:cx1="http://schemas.microsoft.com/office/drawing/2015/9/8/chartex" xmlns:cx2="http://schemas.microsoft.com/office/drawing/2015/10/21/chartex" xmlns:cx3="http://schemas.microsoft.com/office/drawing/2016/5/9/chartex" xmlns:cx4="http://schemas.microsoft.com/office/drawing/2016/5/10/chartex" xmlns:cx5="http://schemas.microsoft.com/office/drawing/2016/5/11/chartex" xmlns:cx6="http://schemas.microsoft.com/office/drawing/2016/5/12/chartex" xmlns:cx7="http://schemas.microsoft.com/office/drawing/2016/5/13/chartex" xmlns:cx8="http://schemas.microsoft.com/office/drawing/2016/5/14/chartex" xmlns:mc="http://schemas.openxmlformats.org/markup-compatibility/2006" xmlns:aink="http://schemas.microsoft.com/office/drawing/2016/ink" xmlns:am3d="http://schemas.microsoft.com/office/drawing/2017/model3d" xmlns:o="urn:schemas-microsoft-com:office:office" xmlns:oel="http://schemas.microsoft.com/office/2019/extlst" xmlns:r="http://schemas.openxmlformats.org/officeDocument/2006/relationships" xmlns:m="http://schemas.openxmlformats.org/officeDocument/2006/math" xmlns:v="urn:schemas-microsoft-com:vml" xmlns:wp14="http://schemas.microsoft.com/office/word/2010/wordprocessingDrawing" xmlns:wp="http://schemas.openxmlformats.org/drawingml/2006/wordprocessingDrawing" xmlns:w10="urn:schemas-microsoft-com:office:word" xmlns:w="http://schemas.openxmlformats.org/wordprocessingml/2006/main" xmlns:w14="http://schemas.microsoft.com/office/word/2010/wordml" xmlns:w15="http://schemas.microsoft.com/office/word/2012/wordml" xmlns:w16cex="http://schemas.microsoft.com/office/word/2018/wordml/cex" xmlns:w16cid="http://schemas.microsoft.com/office/word/2016/wordml/cid" xmlns:w16="http://schemas.microsoft.com/office/word/2018/wordml" xmlns:w16du="http://schemas.microsoft.com/office/word/2023/wordml/word16du" xmlns:w16sdtdh="http://schemas.microsoft.com/office/word/2020/wordml/sdtdatahash" xmlns:w16sdtfl="http://schemas.microsoft.com/office/word/2024/wordml/sdtformatlock" xmlns:w16se="http://schemas.microsoft.com/office/word/2015/wordml/symex" xmlns:wpg="http://schemas.microsoft.com/office/word/2010/wordprocessingGroup" xmlns:wpi="http://schemas.microsoft.com/office/word/2010/wordprocessingInk" xmlns:wne="http://schemas.microsoft.com/office/word/2006/wordml" xmlns:wps="http://schemas.microsoft.com/office/word/2010/wordprocessingShape" mc:Ignorable="w14 w15 w16se w16cid w16 w16cex w16sdtdh w16sdtfl w16du wp14">
+<w:footnotes xmlns:wpc="http://schemas.microsoft.com/office/word/2010/wordprocessingCanvas" xmlns:cx="http://schemas.microsoft.com/office/drawing/2014/chartex" xmlns:cx1="http://schemas.microsoft.com/office/drawing/2015/9/8/chartex" xmlns:cx2="http://schemas.microsoft.com/office/drawing/2015/10/21/chartex" xmlns:cx3="http://schemas.microsoft.com/office/drawing/2016/5/9/chartex" xmlns:cx4="http://schemas.microsoft.com/office/drawing/2016/5/10/chartex" xmlns:cx5="http://schemas.microsoft.com/office/drawing/2016/5/11/chartex" xmlns:cx6="http://schemas.microsoft.com/office/drawing/2016/5/12/chartex" xmlns:cx7="http://schemas.microsoft.com/office/drawing/2016/5/13/chartex" xmlns:cx8="http://schemas.microsoft.com/office/drawing/2016/5/14/chartex" xmlns:mc="http://schemas.openxmlformats.org/markup-compatibility/2006" xmlns:m="http://schemas.openxmlformats.org/officeDocument/2006/math" xmlns:aink="http://schemas.microsoft.com/office/drawing/2016/ink" xmlns:am3d="http://schemas.microsoft.com/office/drawing/2017/model3d" xmlns:oel="http://schemas.microsoft.com/office/2019/extlst" xmlns:r="http://schemas.openxmlformats.org/officeDocument/2006/relationships" xmlns:wp14="http://schemas.microsoft.com/office/word/2010/wordprocessingDrawing" xmlns:wp="http://schemas.openxmlformats.org/drawingml/2006/wordprocessingDrawing" xmlns:wpg="http://schemas.microsoft.com/office/word/2010/wordprocessingGroup" xmlns:wpi="http://schemas.microsoft.com/office/word/2010/wordprocessingInk" xmlns:wps="http://schemas.microsoft.com/office/word/2010/wordprocessingShape" xmlns:o="urn:schemas-microsoft-com:office:office" xmlns:v="urn:schemas-microsoft-com:vml" xmlns:w10="urn:schemas-microsoft-com:office:word" xmlns:w="http://schemas.openxmlformats.org/wordprocessingml/2006/main" xmlns:w14="http://schemas.microsoft.com/office/word/2010/wordml" xmlns:w15="http://schemas.microsoft.com/office/word/2012/wordml" xmlns:w16cei="http://schemas.microsoft.com/office/word/2026/wordml/cei" xmlns:w16cex="http://schemas.microsoft.com/office/word/2018/wordml/cex" xmlns:w16cid="http://schemas.microsoft.com/office/word/2016/wordml/cid" xmlns:w16="http://schemas.microsoft.com/office/word/2018/wordml" xmlns:w16sdtdh="http://schemas.microsoft.com/office/word/2020/wordml/sdtdatahash" xmlns:w16sdtfl="http://schemas.microsoft.com/office/word/2024/wordml/sdtformatlock" xmlns:w16se="http://schemas.microsoft.com/office/word/2015/wordml/symex" xmlns:w16du="http://schemas.microsoft.com/office/word/2023/wordml/word16du" xmlns:wne="http://schemas.microsoft.com/office/word/2006/wordml" mc:Ignorable="w14 w15 w16se w16cid w16 w16cex w16sdtdh w16sdtfl w16du wp14">
   <w:footnote w:type="separator" w:id="-1">
     <w:p>
       <w:pPr>
@@ -22398,7 +24596,7 @@
 </file>
 
 <file path=word/header1.xml><?xml version="1.0" encoding="utf-8"?>
-<w:hdr xmlns:wpc="http://schemas.microsoft.com/office/word/2010/wordprocessingCanvas" xmlns:cx="http://schemas.microsoft.com/office/drawing/2014/chartex" xmlns:cx1="http://schemas.microsoft.com/office/drawing/2015/9/8/chartex" xmlns:cx2="http://schemas.microsoft.com/office/drawing/2015/10/21/chartex" xmlns:cx3="http://schemas.microsoft.com/office/drawing/2016/5/9/chartex" xmlns:cx4="http://schemas.microsoft.com/office/drawing/2016/5/10/chartex" xmlns:cx5="http://schemas.microsoft.com/office/drawing/2016/5/11/chartex" xmlns:cx6="http://schemas.microsoft.com/office/drawing/2016/5/12/chartex" xmlns:cx7="http://schemas.microsoft.com/office/drawing/2016/5/13/chartex" xmlns:cx8="http://schemas.microsoft.com/office/drawing/2016/5/14/chartex" xmlns:mc="http://schemas.openxmlformats.org/markup-compatibility/2006" xmlns:aink="http://schemas.microsoft.com/office/drawing/2016/ink" xmlns:am3d="http://schemas.microsoft.com/office/drawing/2017/model3d" xmlns:o="urn:schemas-microsoft-com:office:office" xmlns:oel="http://schemas.microsoft.com/office/2019/extlst" xmlns:r="http://schemas.openxmlformats.org/officeDocument/2006/relationships" xmlns:m="http://schemas.openxmlformats.org/officeDocument/2006/math" xmlns:v="urn:schemas-microsoft-com:vml" xmlns:wp14="http://schemas.microsoft.com/office/word/2010/wordprocessingDrawing" xmlns:wp="http://schemas.openxmlformats.org/drawingml/2006/wordprocessingDrawing" xmlns:w10="urn:schemas-microsoft-com:office:word" xmlns:w="http://schemas.openxmlformats.org/wordprocessingml/2006/main" xmlns:w14="http://schemas.microsoft.com/office/word/2010/wordml" xmlns:w15="http://schemas.microsoft.com/office/word/2012/wordml" xmlns:w16cex="http://schemas.microsoft.com/office/word/2018/wordml/cex" xmlns:w16cid="http://schemas.microsoft.com/office/word/2016/wordml/cid" xmlns:w16="http://schemas.microsoft.com/office/word/2018/wordml" xmlns:w16du="http://schemas.microsoft.com/office/word/2023/wordml/word16du" xmlns:w16sdtdh="http://schemas.microsoft.com/office/word/2020/wordml/sdtdatahash" xmlns:w16sdtfl="http://schemas.microsoft.com/office/word/2024/wordml/sdtformatlock" xmlns:w16se="http://schemas.microsoft.com/office/word/2015/wordml/symex" xmlns:wpg="http://schemas.microsoft.com/office/word/2010/wordprocessingGroup" xmlns:wpi="http://schemas.microsoft.com/office/word/2010/wordprocessingInk" xmlns:wne="http://schemas.microsoft.com/office/word/2006/wordml" xmlns:wps="http://schemas.microsoft.com/office/word/2010/wordprocessingShape" mc:Ignorable="w14 w15 w16se w16cid w16 w16cex w16sdtdh w16sdtfl w16du wp14">
+<w:hdr xmlns:wpc="http://schemas.microsoft.com/office/word/2010/wordprocessingCanvas" xmlns:cx="http://schemas.microsoft.com/office/drawing/2014/chartex" xmlns:cx1="http://schemas.microsoft.com/office/drawing/2015/9/8/chartex" xmlns:cx2="http://schemas.microsoft.com/office/drawing/2015/10/21/chartex" xmlns:cx3="http://schemas.microsoft.com/office/drawing/2016/5/9/chartex" xmlns:cx4="http://schemas.microsoft.com/office/drawing/2016/5/10/chartex" xmlns:cx5="http://schemas.microsoft.com/office/drawing/2016/5/11/chartex" xmlns:cx6="http://schemas.microsoft.com/office/drawing/2016/5/12/chartex" xmlns:cx7="http://schemas.microsoft.com/office/drawing/2016/5/13/chartex" xmlns:cx8="http://schemas.microsoft.com/office/drawing/2016/5/14/chartex" xmlns:mc="http://schemas.openxmlformats.org/markup-compatibility/2006" xmlns:m="http://schemas.openxmlformats.org/officeDocument/2006/math" xmlns:aink="http://schemas.microsoft.com/office/drawing/2016/ink" xmlns:am3d="http://schemas.microsoft.com/office/drawing/2017/model3d" xmlns:oel="http://schemas.microsoft.com/office/2019/extlst" xmlns:r="http://schemas.openxmlformats.org/officeDocument/2006/relationships" xmlns:wp14="http://schemas.microsoft.com/office/word/2010/wordprocessingDrawing" xmlns:wp="http://schemas.openxmlformats.org/drawingml/2006/wordprocessingDrawing" xmlns:wpg="http://schemas.microsoft.com/office/word/2010/wordprocessingGroup" xmlns:wpi="http://schemas.microsoft.com/office/word/2010/wordprocessingInk" xmlns:wps="http://schemas.microsoft.com/office/word/2010/wordprocessingShape" xmlns:o="urn:schemas-microsoft-com:office:office" xmlns:v="urn:schemas-microsoft-com:vml" xmlns:w10="urn:schemas-microsoft-com:office:word" xmlns:w="http://schemas.openxmlformats.org/wordprocessingml/2006/main" xmlns:w14="http://schemas.microsoft.com/office/word/2010/wordml" xmlns:w15="http://schemas.microsoft.com/office/word/2012/wordml" xmlns:w16cei="http://schemas.microsoft.com/office/word/2026/wordml/cei" xmlns:w16cex="http://schemas.microsoft.com/office/word/2018/wordml/cex" xmlns:w16cid="http://schemas.microsoft.com/office/word/2016/wordml/cid" xmlns:w16="http://schemas.microsoft.com/office/word/2018/wordml" xmlns:w16sdtdh="http://schemas.microsoft.com/office/word/2020/wordml/sdtdatahash" xmlns:w16sdtfl="http://schemas.microsoft.com/office/word/2024/wordml/sdtformatlock" xmlns:w16se="http://schemas.microsoft.com/office/word/2015/wordml/symex" xmlns:w16du="http://schemas.microsoft.com/office/word/2023/wordml/word16du" xmlns:wne="http://schemas.microsoft.com/office/word/2006/wordml" mc:Ignorable="w14 w15 w16se w16cid w16 w16cex w16sdtdh w16sdtfl w16du wp14">
   <w:p>
     <w:pPr>
       <w:pStyle w:val="Yltunniste"/>
@@ -22428,7 +24626,7 @@
 </file>
 
 <file path=word/header2.xml><?xml version="1.0" encoding="utf-8"?>
-<w:hdr xmlns:wpc="http://schemas.microsoft.com/office/word/2010/wordprocessingCanvas" xmlns:cx="http://schemas.microsoft.com/office/drawing/2014/chartex" xmlns:cx1="http://schemas.microsoft.com/office/drawing/2015/9/8/chartex" xmlns:cx2="http://schemas.microsoft.com/office/drawing/2015/10/21/chartex" xmlns:cx3="http://schemas.microsoft.com/office/drawing/2016/5/9/chartex" xmlns:cx4="http://schemas.microsoft.com/office/drawing/2016/5/10/chartex" xmlns:cx5="http://schemas.microsoft.com/office/drawing/2016/5/11/chartex" xmlns:cx6="http://schemas.microsoft.com/office/drawing/2016/5/12/chartex" xmlns:cx7="http://schemas.microsoft.com/office/drawing/2016/5/13/chartex" xmlns:cx8="http://schemas.microsoft.com/office/drawing/2016/5/14/chartex" xmlns:mc="http://schemas.openxmlformats.org/markup-compatibility/2006" xmlns:aink="http://schemas.microsoft.com/office/drawing/2016/ink" xmlns:am3d="http://schemas.microsoft.com/office/drawing/2017/model3d" xmlns:o="urn:schemas-microsoft-com:office:office" xmlns:oel="http://schemas.microsoft.com/office/2019/extlst" xmlns:r="http://schemas.openxmlformats.org/officeDocument/2006/relationships" xmlns:m="http://schemas.openxmlformats.org/officeDocument/2006/math" xmlns:v="urn:schemas-microsoft-com:vml" xmlns:wp14="http://schemas.microsoft.com/office/word/2010/wordprocessingDrawing" xmlns:wp="http://schemas.openxmlformats.org/drawingml/2006/wordprocessingDrawing" xmlns:w10="urn:schemas-microsoft-com:office:word" xmlns:w="http://schemas.openxmlformats.org/wordprocessingml/2006/main" xmlns:w14="http://schemas.microsoft.com/office/word/2010/wordml" xmlns:w15="http://schemas.microsoft.com/office/word/2012/wordml" xmlns:w16cex="http://schemas.microsoft.com/office/word/2018/wordml/cex" xmlns:w16cid="http://schemas.microsoft.com/office/word/2016/wordml/cid" xmlns:w16="http://schemas.microsoft.com/office/word/2018/wordml" xmlns:w16du="http://schemas.microsoft.com/office/word/2023/wordml/word16du" xmlns:w16sdtdh="http://schemas.microsoft.com/office/word/2020/wordml/sdtdatahash" xmlns:w16sdtfl="http://schemas.microsoft.com/office/word/2024/wordml/sdtformatlock" xmlns:w16se="http://schemas.microsoft.com/office/word/2015/wordml/symex" xmlns:wpg="http://schemas.microsoft.com/office/word/2010/wordprocessingGroup" xmlns:wpi="http://schemas.microsoft.com/office/word/2010/wordprocessingInk" xmlns:wne="http://schemas.microsoft.com/office/word/2006/wordml" xmlns:wps="http://schemas.microsoft.com/office/word/2010/wordprocessingShape" mc:Ignorable="w14 w15 w16se w16cid w16 w16cex w16sdtdh w16sdtfl w16du wp14">
+<w:hdr xmlns:wpc="http://schemas.microsoft.com/office/word/2010/wordprocessingCanvas" xmlns:cx="http://schemas.microsoft.com/office/drawing/2014/chartex" xmlns:cx1="http://schemas.microsoft.com/office/drawing/2015/9/8/chartex" xmlns:cx2="http://schemas.microsoft.com/office/drawing/2015/10/21/chartex" xmlns:cx3="http://schemas.microsoft.com/office/drawing/2016/5/9/chartex" xmlns:cx4="http://schemas.microsoft.com/office/drawing/2016/5/10/chartex" xmlns:cx5="http://schemas.microsoft.com/office/drawing/2016/5/11/chartex" xmlns:cx6="http://schemas.microsoft.com/office/drawing/2016/5/12/chartex" xmlns:cx7="http://schemas.microsoft.com/office/drawing/2016/5/13/chartex" xmlns:cx8="http://schemas.microsoft.com/office/drawing/2016/5/14/chartex" xmlns:mc="http://schemas.openxmlformats.org/markup-compatibility/2006" xmlns:m="http://schemas.openxmlformats.org/officeDocument/2006/math" xmlns:aink="http://schemas.microsoft.com/office/drawing/2016/ink" xmlns:am3d="http://schemas.microsoft.com/office/drawing/2017/model3d" xmlns:oel="http://schemas.microsoft.com/office/2019/extlst" xmlns:r="http://schemas.openxmlformats.org/officeDocument/2006/relationships" xmlns:wp14="http://schemas.microsoft.com/office/word/2010/wordprocessingDrawing" xmlns:wp="http://schemas.openxmlformats.org/drawingml/2006/wordprocessingDrawing" xmlns:wpg="http://schemas.microsoft.com/office/word/2010/wordprocessingGroup" xmlns:wpi="http://schemas.microsoft.com/office/word/2010/wordprocessingInk" xmlns:wps="http://schemas.microsoft.com/office/word/2010/wordprocessingShape" xmlns:o="urn:schemas-microsoft-com:office:office" xmlns:v="urn:schemas-microsoft-com:vml" xmlns:w10="urn:schemas-microsoft-com:office:word" xmlns:w="http://schemas.openxmlformats.org/wordprocessingml/2006/main" xmlns:w14="http://schemas.microsoft.com/office/word/2010/wordml" xmlns:w15="http://schemas.microsoft.com/office/word/2012/wordml" xmlns:w16cei="http://schemas.microsoft.com/office/word/2026/wordml/cei" xmlns:w16cex="http://schemas.microsoft.com/office/word/2018/wordml/cex" xmlns:w16cid="http://schemas.microsoft.com/office/word/2016/wordml/cid" xmlns:w16="http://schemas.microsoft.com/office/word/2018/wordml" xmlns:w16sdtdh="http://schemas.microsoft.com/office/word/2020/wordml/sdtdatahash" xmlns:w16sdtfl="http://schemas.microsoft.com/office/word/2024/wordml/sdtformatlock" xmlns:w16se="http://schemas.microsoft.com/office/word/2015/wordml/symex" xmlns:w16du="http://schemas.microsoft.com/office/word/2023/wordml/word16du" xmlns:wne="http://schemas.microsoft.com/office/word/2006/wordml" mc:Ignorable="w14 w15 w16se w16cid w16 w16cex w16sdtdh w16sdtfl w16du wp14">
   <w:sdt>
     <w:sdtPr>
       <w:id w:val="858696863"/>
@@ -22473,7 +24671,7 @@
 </file>
 
 <file path=word/header3.xml><?xml version="1.0" encoding="utf-8"?>
-<w:hdr xmlns:wpc="http://schemas.microsoft.com/office/word/2010/wordprocessingCanvas" xmlns:cx="http://schemas.microsoft.com/office/drawing/2014/chartex" xmlns:cx1="http://schemas.microsoft.com/office/drawing/2015/9/8/chartex" xmlns:cx2="http://schemas.microsoft.com/office/drawing/2015/10/21/chartex" xmlns:cx3="http://schemas.microsoft.com/office/drawing/2016/5/9/chartex" xmlns:cx4="http://schemas.microsoft.com/office/drawing/2016/5/10/chartex" xmlns:cx5="http://schemas.microsoft.com/office/drawing/2016/5/11/chartex" xmlns:cx6="http://schemas.microsoft.com/office/drawing/2016/5/12/chartex" xmlns:cx7="http://schemas.microsoft.com/office/drawing/2016/5/13/chartex" xmlns:cx8="http://schemas.microsoft.com/office/drawing/2016/5/14/chartex" xmlns:mc="http://schemas.openxmlformats.org/markup-compatibility/2006" xmlns:aink="http://schemas.microsoft.com/office/drawing/2016/ink" xmlns:am3d="http://schemas.microsoft.com/office/drawing/2017/model3d" xmlns:o="urn:schemas-microsoft-com:office:office" xmlns:oel="http://schemas.microsoft.com/office/2019/extlst" xmlns:r="http://schemas.openxmlformats.org/officeDocument/2006/relationships" xmlns:m="http://schemas.openxmlformats.org/officeDocument/2006/math" xmlns:v="urn:schemas-microsoft-com:vml" xmlns:wp14="http://schemas.microsoft.com/office/word/2010/wordprocessingDrawing" xmlns:wp="http://schemas.openxmlformats.org/drawingml/2006/wordprocessingDrawing" xmlns:w10="urn:schemas-microsoft-com:office:word" xmlns:w="http://schemas.openxmlformats.org/wordprocessingml/2006/main" xmlns:w14="http://schemas.microsoft.com/office/word/2010/wordml" xmlns:w15="http://schemas.microsoft.com/office/word/2012/wordml" xmlns:w16cex="http://schemas.microsoft.com/office/word/2018/wordml/cex" xmlns:w16cid="http://schemas.microsoft.com/office/word/2016/wordml/cid" xmlns:w16="http://schemas.microsoft.com/office/word/2018/wordml" xmlns:w16du="http://schemas.microsoft.com/office/word/2023/wordml/word16du" xmlns:w16sdtdh="http://schemas.microsoft.com/office/word/2020/wordml/sdtdatahash" xmlns:w16sdtfl="http://schemas.microsoft.com/office/word/2024/wordml/sdtformatlock" xmlns:w16se="http://schemas.microsoft.com/office/word/2015/wordml/symex" xmlns:wpg="http://schemas.microsoft.com/office/word/2010/wordprocessingGroup" xmlns:wpi="http://schemas.microsoft.com/office/word/2010/wordprocessingInk" xmlns:wne="http://schemas.microsoft.com/office/word/2006/wordml" xmlns:wps="http://schemas.microsoft.com/office/word/2010/wordprocessingShape" mc:Ignorable="w14 w15 w16se w16cid w16 w16cex w16sdtdh w16sdtfl w16du wp14">
+<w:hdr xmlns:wpc="http://schemas.microsoft.com/office/word/2010/wordprocessingCanvas" xmlns:cx="http://schemas.microsoft.com/office/drawing/2014/chartex" xmlns:cx1="http://schemas.microsoft.com/office/drawing/2015/9/8/chartex" xmlns:cx2="http://schemas.microsoft.com/office/drawing/2015/10/21/chartex" xmlns:cx3="http://schemas.microsoft.com/office/drawing/2016/5/9/chartex" xmlns:cx4="http://schemas.microsoft.com/office/drawing/2016/5/10/chartex" xmlns:cx5="http://schemas.microsoft.com/office/drawing/2016/5/11/chartex" xmlns:cx6="http://schemas.microsoft.com/office/drawing/2016/5/12/chartex" xmlns:cx7="http://schemas.microsoft.com/office/drawing/2016/5/13/chartex" xmlns:cx8="http://schemas.microsoft.com/office/drawing/2016/5/14/chartex" xmlns:mc="http://schemas.openxmlformats.org/markup-compatibility/2006" xmlns:m="http://schemas.openxmlformats.org/officeDocument/2006/math" xmlns:aink="http://schemas.microsoft.com/office/drawing/2016/ink" xmlns:am3d="http://schemas.microsoft.com/office/drawing/2017/model3d" xmlns:oel="http://schemas.microsoft.com/office/2019/extlst" xmlns:r="http://schemas.openxmlformats.org/officeDocument/2006/relationships" xmlns:wp14="http://schemas.microsoft.com/office/word/2010/wordprocessingDrawing" xmlns:wp="http://schemas.openxmlformats.org/drawingml/2006/wordprocessingDrawing" xmlns:wpg="http://schemas.microsoft.com/office/word/2010/wordprocessingGroup" xmlns:wpi="http://schemas.microsoft.com/office/word/2010/wordprocessingInk" xmlns:wps="http://schemas.microsoft.com/office/word/2010/wordprocessingShape" xmlns:o="urn:schemas-microsoft-com:office:office" xmlns:v="urn:schemas-microsoft-com:vml" xmlns:w10="urn:schemas-microsoft-com:office:word" xmlns:w="http://schemas.openxmlformats.org/wordprocessingml/2006/main" xmlns:w14="http://schemas.microsoft.com/office/word/2010/wordml" xmlns:w15="http://schemas.microsoft.com/office/word/2012/wordml" xmlns:w16cei="http://schemas.microsoft.com/office/word/2026/wordml/cei" xmlns:w16cex="http://schemas.microsoft.com/office/word/2018/wordml/cex" xmlns:w16cid="http://schemas.microsoft.com/office/word/2016/wordml/cid" xmlns:w16="http://schemas.microsoft.com/office/word/2018/wordml" xmlns:w16sdtdh="http://schemas.microsoft.com/office/word/2020/wordml/sdtdatahash" xmlns:w16sdtfl="http://schemas.microsoft.com/office/word/2024/wordml/sdtformatlock" xmlns:w16se="http://schemas.microsoft.com/office/word/2015/wordml/symex" xmlns:w16du="http://schemas.microsoft.com/office/word/2023/wordml/word16du" xmlns:wne="http://schemas.microsoft.com/office/word/2006/wordml" mc:Ignorable="w14 w15 w16se w16cid w16 w16cex w16sdtdh w16sdtfl w16du wp14">
   <w:sdt>
     <w:sdtPr>
       <w:id w:val="-911164709"/>
@@ -22518,7 +24716,7 @@
 </file>
 
 <file path=word/header4.xml><?xml version="1.0" encoding="utf-8"?>
-<w:hdr xmlns:wpc="http://schemas.microsoft.com/office/word/2010/wordprocessingCanvas" xmlns:cx="http://schemas.microsoft.com/office/drawing/2014/chartex" xmlns:cx1="http://schemas.microsoft.com/office/drawing/2015/9/8/chartex" xmlns:cx2="http://schemas.microsoft.com/office/drawing/2015/10/21/chartex" xmlns:cx3="http://schemas.microsoft.com/office/drawing/2016/5/9/chartex" xmlns:cx4="http://schemas.microsoft.com/office/drawing/2016/5/10/chartex" xmlns:cx5="http://schemas.microsoft.com/office/drawing/2016/5/11/chartex" xmlns:cx6="http://schemas.microsoft.com/office/drawing/2016/5/12/chartex" xmlns:cx7="http://schemas.microsoft.com/office/drawing/2016/5/13/chartex" xmlns:cx8="http://schemas.microsoft.com/office/drawing/2016/5/14/chartex" xmlns:mc="http://schemas.openxmlformats.org/markup-compatibility/2006" xmlns:aink="http://schemas.microsoft.com/office/drawing/2016/ink" xmlns:am3d="http://schemas.microsoft.com/office/drawing/2017/model3d" xmlns:o="urn:schemas-microsoft-com:office:office" xmlns:oel="http://schemas.microsoft.com/office/2019/extlst" xmlns:r="http://schemas.openxmlformats.org/officeDocument/2006/relationships" xmlns:m="http://schemas.openxmlformats.org/officeDocument/2006/math" xmlns:v="urn:schemas-microsoft-com:vml" xmlns:wp14="http://schemas.microsoft.com/office/word/2010/wordprocessingDrawing" xmlns:wp="http://schemas.openxmlformats.org/drawingml/2006/wordprocessingDrawing" xmlns:w10="urn:schemas-microsoft-com:office:word" xmlns:w="http://schemas.openxmlformats.org/wordprocessingml/2006/main" xmlns:w14="http://schemas.microsoft.com/office/word/2010/wordml" xmlns:w15="http://schemas.microsoft.com/office/word/2012/wordml" xmlns:w16cex="http://schemas.microsoft.com/office/word/2018/wordml/cex" xmlns:w16cid="http://schemas.microsoft.com/office/word/2016/wordml/cid" xmlns:w16="http://schemas.microsoft.com/office/word/2018/wordml" xmlns:w16du="http://schemas.microsoft.com/office/word/2023/wordml/word16du" xmlns:w16sdtdh="http://schemas.microsoft.com/office/word/2020/wordml/sdtdatahash" xmlns:w16sdtfl="http://schemas.microsoft.com/office/word/2024/wordml/sdtformatlock" xmlns:w16se="http://schemas.microsoft.com/office/word/2015/wordml/symex" xmlns:wpg="http://schemas.microsoft.com/office/word/2010/wordprocessingGroup" xmlns:wpi="http://schemas.microsoft.com/office/word/2010/wordprocessingInk" xmlns:wne="http://schemas.microsoft.com/office/word/2006/wordml" xmlns:wps="http://schemas.microsoft.com/office/word/2010/wordprocessingShape" mc:Ignorable="w14 w15 w16se w16cid w16 w16cex w16sdtdh w16sdtfl w16du wp14">
+<w:hdr xmlns:wpc="http://schemas.microsoft.com/office/word/2010/wordprocessingCanvas" xmlns:cx="http://schemas.microsoft.com/office/drawing/2014/chartex" xmlns:cx1="http://schemas.microsoft.com/office/drawing/2015/9/8/chartex" xmlns:cx2="http://schemas.microsoft.com/office/drawing/2015/10/21/chartex" xmlns:cx3="http://schemas.microsoft.com/office/drawing/2016/5/9/chartex" xmlns:cx4="http://schemas.microsoft.com/office/drawing/2016/5/10/chartex" xmlns:cx5="http://schemas.microsoft.com/office/drawing/2016/5/11/chartex" xmlns:cx6="http://schemas.microsoft.com/office/drawing/2016/5/12/chartex" xmlns:cx7="http://schemas.microsoft.com/office/drawing/2016/5/13/chartex" xmlns:cx8="http://schemas.microsoft.com/office/drawing/2016/5/14/chartex" xmlns:mc="http://schemas.openxmlformats.org/markup-compatibility/2006" xmlns:m="http://schemas.openxmlformats.org/officeDocument/2006/math" xmlns:aink="http://schemas.microsoft.com/office/drawing/2016/ink" xmlns:am3d="http://schemas.microsoft.com/office/drawing/2017/model3d" xmlns:oel="http://schemas.microsoft.com/office/2019/extlst" xmlns:r="http://schemas.openxmlformats.org/officeDocument/2006/relationships" xmlns:wp14="http://schemas.microsoft.com/office/word/2010/wordprocessingDrawing" xmlns:wp="http://schemas.openxmlformats.org/drawingml/2006/wordprocessingDrawing" xmlns:wpg="http://schemas.microsoft.com/office/word/2010/wordprocessingGroup" xmlns:wpi="http://schemas.microsoft.com/office/word/2010/wordprocessingInk" xmlns:wps="http://schemas.microsoft.com/office/word/2010/wordprocessingShape" xmlns:o="urn:schemas-microsoft-com:office:office" xmlns:v="urn:schemas-microsoft-com:vml" xmlns:w10="urn:schemas-microsoft-com:office:word" xmlns:w="http://schemas.openxmlformats.org/wordprocessingml/2006/main" xmlns:w14="http://schemas.microsoft.com/office/word/2010/wordml" xmlns:w15="http://schemas.microsoft.com/office/word/2012/wordml" xmlns:w16cei="http://schemas.microsoft.com/office/word/2026/wordml/cei" xmlns:w16cex="http://schemas.microsoft.com/office/word/2018/wordml/cex" xmlns:w16cid="http://schemas.microsoft.com/office/word/2016/wordml/cid" xmlns:w16="http://schemas.microsoft.com/office/word/2018/wordml" xmlns:w16sdtdh="http://schemas.microsoft.com/office/word/2020/wordml/sdtdatahash" xmlns:w16sdtfl="http://schemas.microsoft.com/office/word/2024/wordml/sdtformatlock" xmlns:w16se="http://schemas.microsoft.com/office/word/2015/wordml/symex" xmlns:w16du="http://schemas.microsoft.com/office/word/2023/wordml/word16du" xmlns:wne="http://schemas.microsoft.com/office/word/2006/wordml" mc:Ignorable="w14 w15 w16se w16cid w16 w16cex w16sdtdh w16sdtfl w16du wp14">
   <w:p>
     <w:pPr>
       <w:pStyle w:val="Yltunniste"/>
@@ -22528,7 +24726,7 @@
 </file>
 
 <file path=word/header5.xml><?xml version="1.0" encoding="utf-8"?>
-<w:hdr xmlns:wpc="http://schemas.microsoft.com/office/word/2010/wordprocessingCanvas" xmlns:cx="http://schemas.microsoft.com/office/drawing/2014/chartex" xmlns:cx1="http://schemas.microsoft.com/office/drawing/2015/9/8/chartex" xmlns:cx2="http://schemas.microsoft.com/office/drawing/2015/10/21/chartex" xmlns:cx3="http://schemas.microsoft.com/office/drawing/2016/5/9/chartex" xmlns:cx4="http://schemas.microsoft.com/office/drawing/2016/5/10/chartex" xmlns:cx5="http://schemas.microsoft.com/office/drawing/2016/5/11/chartex" xmlns:cx6="http://schemas.microsoft.com/office/drawing/2016/5/12/chartex" xmlns:cx7="http://schemas.microsoft.com/office/drawing/2016/5/13/chartex" xmlns:cx8="http://schemas.microsoft.com/office/drawing/2016/5/14/chartex" xmlns:mc="http://schemas.openxmlformats.org/markup-compatibility/2006" xmlns:aink="http://schemas.microsoft.com/office/drawing/2016/ink" xmlns:am3d="http://schemas.microsoft.com/office/drawing/2017/model3d" xmlns:o="urn:schemas-microsoft-com:office:office" xmlns:oel="http://schemas.microsoft.com/office/2019/extlst" xmlns:r="http://schemas.openxmlformats.org/officeDocument/2006/relationships" xmlns:m="http://schemas.openxmlformats.org/officeDocument/2006/math" xmlns:v="urn:schemas-microsoft-com:vml" xmlns:wp14="http://schemas.microsoft.com/office/word/2010/wordprocessingDrawing" xmlns:wp="http://schemas.openxmlformats.org/drawingml/2006/wordprocessingDrawing" xmlns:w10="urn:schemas-microsoft-com:office:word" xmlns:w="http://schemas.openxmlformats.org/wordprocessingml/2006/main" xmlns:w14="http://schemas.microsoft.com/office/word/2010/wordml" xmlns:w15="http://schemas.microsoft.com/office/word/2012/wordml" xmlns:w16cex="http://schemas.microsoft.com/office/word/2018/wordml/cex" xmlns:w16cid="http://schemas.microsoft.com/office/word/2016/wordml/cid" xmlns:w16="http://schemas.microsoft.com/office/word/2018/wordml" xmlns:w16du="http://schemas.microsoft.com/office/word/2023/wordml/word16du" xmlns:w16sdtdh="http://schemas.microsoft.com/office/word/2020/wordml/sdtdatahash" xmlns:w16sdtfl="http://schemas.microsoft.com/office/word/2024/wordml/sdtformatlock" xmlns:w16se="http://schemas.microsoft.com/office/word/2015/wordml/symex" xmlns:wpg="http://schemas.microsoft.com/office/word/2010/wordprocessingGroup" xmlns:wpi="http://schemas.microsoft.com/office/word/2010/wordprocessingInk" xmlns:wne="http://schemas.microsoft.com/office/word/2006/wordml" xmlns:wps="http://schemas.microsoft.com/office/word/2010/wordprocessingShape" mc:Ignorable="w14 w15 w16se w16cid w16 w16cex w16sdtdh w16sdtfl w16du wp14">
+<w:hdr xmlns:wpc="http://schemas.microsoft.com/office/word/2010/wordprocessingCanvas" xmlns:cx="http://schemas.microsoft.com/office/drawing/2014/chartex" xmlns:cx1="http://schemas.microsoft.com/office/drawing/2015/9/8/chartex" xmlns:cx2="http://schemas.microsoft.com/office/drawing/2015/10/21/chartex" xmlns:cx3="http://schemas.microsoft.com/office/drawing/2016/5/9/chartex" xmlns:cx4="http://schemas.microsoft.com/office/drawing/2016/5/10/chartex" xmlns:cx5="http://schemas.microsoft.com/office/drawing/2016/5/11/chartex" xmlns:cx6="http://schemas.microsoft.com/office/drawing/2016/5/12/chartex" xmlns:cx7="http://schemas.microsoft.com/office/drawing/2016/5/13/chartex" xmlns:cx8="http://schemas.microsoft.com/office/drawing/2016/5/14/chartex" xmlns:mc="http://schemas.openxmlformats.org/markup-compatibility/2006" xmlns:m="http://schemas.openxmlformats.org/officeDocument/2006/math" xmlns:aink="http://schemas.microsoft.com/office/drawing/2016/ink" xmlns:am3d="http://schemas.microsoft.com/office/drawing/2017/model3d" xmlns:oel="http://schemas.microsoft.com/office/2019/extlst" xmlns:r="http://schemas.openxmlformats.org/officeDocument/2006/relationships" xmlns:wp14="http://schemas.microsoft.com/office/word/2010/wordprocessingDrawing" xmlns:wp="http://schemas.openxmlformats.org/drawingml/2006/wordprocessingDrawing" xmlns:wpg="http://schemas.microsoft.com/office/word/2010/wordprocessingGroup" xmlns:wpi="http://schemas.microsoft.com/office/word/2010/wordprocessingInk" xmlns:wps="http://schemas.microsoft.com/office/word/2010/wordprocessingShape" xmlns:o="urn:schemas-microsoft-com:office:office" xmlns:v="urn:schemas-microsoft-com:vml" xmlns:w10="urn:schemas-microsoft-com:office:word" xmlns:w="http://schemas.openxmlformats.org/wordprocessingml/2006/main" xmlns:w14="http://schemas.microsoft.com/office/word/2010/wordml" xmlns:w15="http://schemas.microsoft.com/office/word/2012/wordml" xmlns:w16cei="http://schemas.microsoft.com/office/word/2026/wordml/cei" xmlns:w16cex="http://schemas.microsoft.com/office/word/2018/wordml/cex" xmlns:w16cid="http://schemas.microsoft.com/office/word/2016/wordml/cid" xmlns:w16="http://schemas.microsoft.com/office/word/2018/wordml" xmlns:w16sdtdh="http://schemas.microsoft.com/office/word/2020/wordml/sdtdatahash" xmlns:w16sdtfl="http://schemas.microsoft.com/office/word/2024/wordml/sdtformatlock" xmlns:w16se="http://schemas.microsoft.com/office/word/2015/wordml/symex" xmlns:w16du="http://schemas.microsoft.com/office/word/2023/wordml/word16du" xmlns:wne="http://schemas.microsoft.com/office/word/2006/wordml" mc:Ignorable="w14 w15 w16se w16cid w16 w16cex w16sdtdh w16sdtfl w16du wp14">
   <w:sdt>
     <w:sdtPr>
       <w:id w:val="824475838"/>
@@ -22579,7 +24777,7 @@
 </file>
 
 <file path=word/numbering.xml><?xml version="1.0" encoding="utf-8"?>
-<w:numbering xmlns:wpc="http://schemas.microsoft.com/office/word/2010/wordprocessingCanvas" xmlns:cx="http://schemas.microsoft.com/office/drawing/2014/chartex" xmlns:cx1="http://schemas.microsoft.com/office/drawing/2015/9/8/chartex" xmlns:cx2="http://schemas.microsoft.com/office/drawing/2015/10/21/chartex" xmlns:cx3="http://schemas.microsoft.com/office/drawing/2016/5/9/chartex" xmlns:cx4="http://schemas.microsoft.com/office/drawing/2016/5/10/chartex" xmlns:cx5="http://schemas.microsoft.com/office/drawing/2016/5/11/chartex" xmlns:cx6="http://schemas.microsoft.com/office/drawing/2016/5/12/chartex" xmlns:cx7="http://schemas.microsoft.com/office/drawing/2016/5/13/chartex" xmlns:cx8="http://schemas.microsoft.com/office/drawing/2016/5/14/chartex" xmlns:mc="http://schemas.openxmlformats.org/markup-compatibility/2006" xmlns:aink="http://schemas.microsoft.com/office/drawing/2016/ink" xmlns:am3d="http://schemas.microsoft.com/office/drawing/2017/model3d" xmlns:o="urn:schemas-microsoft-com:office:office" xmlns:oel="http://schemas.microsoft.com/office/2019/extlst" xmlns:r="http://schemas.openxmlformats.org/officeDocument/2006/relationships" xmlns:m="http://schemas.openxmlformats.org/officeDocument/2006/math" xmlns:v="urn:schemas-microsoft-com:vml" xmlns:wp14="http://schemas.microsoft.com/office/word/2010/wordprocessingDrawing" xmlns:wp="http://schemas.openxmlformats.org/drawingml/2006/wordprocessingDrawing" xmlns:w10="urn:schemas-microsoft-com:office:word" xmlns:w="http://schemas.openxmlformats.org/wordprocessingml/2006/main" xmlns:w14="http://schemas.microsoft.com/office/word/2010/wordml" xmlns:w15="http://schemas.microsoft.com/office/word/2012/wordml" xmlns:w16cex="http://schemas.microsoft.com/office/word/2018/wordml/cex" xmlns:w16cid="http://schemas.microsoft.com/office/word/2016/wordml/cid" xmlns:w16="http://schemas.microsoft.com/office/word/2018/wordml" xmlns:w16du="http://schemas.microsoft.com/office/word/2023/wordml/word16du" xmlns:w16sdtdh="http://schemas.microsoft.com/office/word/2020/wordml/sdtdatahash" xmlns:w16sdtfl="http://schemas.microsoft.com/office/word/2024/wordml/sdtformatlock" xmlns:w16se="http://schemas.microsoft.com/office/word/2015/wordml/symex" xmlns:wpg="http://schemas.microsoft.com/office/word/2010/wordprocessingGroup" xmlns:wpi="http://schemas.microsoft.com/office/word/2010/wordprocessingInk" xmlns:wne="http://schemas.microsoft.com/office/word/2006/wordml" xmlns:wps="http://schemas.microsoft.com/office/word/2010/wordprocessingShape" mc:Ignorable="w14 w15 w16se w16cid w16 w16cex w16sdtdh w16sdtfl w16du wp14">
+<w:numbering xmlns:wpc="http://schemas.microsoft.com/office/word/2010/wordprocessingCanvas" xmlns:cx="http://schemas.microsoft.com/office/drawing/2014/chartex" xmlns:cx1="http://schemas.microsoft.com/office/drawing/2015/9/8/chartex" xmlns:cx2="http://schemas.microsoft.com/office/drawing/2015/10/21/chartex" xmlns:cx3="http://schemas.microsoft.com/office/drawing/2016/5/9/chartex" xmlns:cx4="http://schemas.microsoft.com/office/drawing/2016/5/10/chartex" xmlns:cx5="http://schemas.microsoft.com/office/drawing/2016/5/11/chartex" xmlns:cx6="http://schemas.microsoft.com/office/drawing/2016/5/12/chartex" xmlns:cx7="http://schemas.microsoft.com/office/drawing/2016/5/13/chartex" xmlns:cx8="http://schemas.microsoft.com/office/drawing/2016/5/14/chartex" xmlns:mc="http://schemas.openxmlformats.org/markup-compatibility/2006" xmlns:m="http://schemas.openxmlformats.org/officeDocument/2006/math" xmlns:aink="http://schemas.microsoft.com/office/drawing/2016/ink" xmlns:am3d="http://schemas.microsoft.com/office/drawing/2017/model3d" xmlns:oel="http://schemas.microsoft.com/office/2019/extlst" xmlns:r="http://schemas.openxmlformats.org/officeDocument/2006/relationships" xmlns:wp14="http://schemas.microsoft.com/office/word/2010/wordprocessingDrawing" xmlns:wp="http://schemas.openxmlformats.org/drawingml/2006/wordprocessingDrawing" xmlns:wpg="http://schemas.microsoft.com/office/word/2010/wordprocessingGroup" xmlns:wpi="http://schemas.microsoft.com/office/word/2010/wordprocessingInk" xmlns:wps="http://schemas.microsoft.com/office/word/2010/wordprocessingShape" xmlns:o="urn:schemas-microsoft-com:office:office" xmlns:v="urn:schemas-microsoft-com:vml" xmlns:w10="urn:schemas-microsoft-com:office:word" xmlns:w="http://schemas.openxmlformats.org/wordprocessingml/2006/main" xmlns:w14="http://schemas.microsoft.com/office/word/2010/wordml" xmlns:w15="http://schemas.microsoft.com/office/word/2012/wordml" xmlns:w16cei="http://schemas.microsoft.com/office/word/2026/wordml/cei" xmlns:w16cex="http://schemas.microsoft.com/office/word/2018/wordml/cex" xmlns:w16cid="http://schemas.microsoft.com/office/word/2016/wordml/cid" xmlns:w16="http://schemas.microsoft.com/office/word/2018/wordml" xmlns:w16sdtdh="http://schemas.microsoft.com/office/word/2020/wordml/sdtdatahash" xmlns:w16sdtfl="http://schemas.microsoft.com/office/word/2024/wordml/sdtformatlock" xmlns:w16se="http://schemas.microsoft.com/office/word/2015/wordml/symex" xmlns:w16du="http://schemas.microsoft.com/office/word/2023/wordml/word16du" xmlns:wne="http://schemas.microsoft.com/office/word/2006/wordml" mc:Ignorable="w14 w15 w16se w16cid w16 w16cex w16sdtdh w16sdtfl w16du wp14">
   <w:abstractNum w:abstractNumId="0" w15:restartNumberingAfterBreak="0">
     <w:nsid w:val="FFFFFF7C"/>
     <w:multiLevelType w:val="singleLevel"/>
@@ -27138,7 +29336,7 @@
 </file>
 
 <file path=word/styles.xml><?xml version="1.0" encoding="utf-8"?>
-<w:styles xmlns:mc="http://schemas.openxmlformats.org/markup-compatibility/2006" xmlns:r="http://schemas.openxmlformats.org/officeDocument/2006/relationships" xmlns:w="http://schemas.openxmlformats.org/wordprocessingml/2006/main" xmlns:w14="http://schemas.microsoft.com/office/word/2010/wordml" xmlns:w15="http://schemas.microsoft.com/office/word/2012/wordml" xmlns:w16cex="http://schemas.microsoft.com/office/word/2018/wordml/cex" xmlns:w16cid="http://schemas.microsoft.com/office/word/2016/wordml/cid" xmlns:w16="http://schemas.microsoft.com/office/word/2018/wordml" xmlns:w16du="http://schemas.microsoft.com/office/word/2023/wordml/word16du" xmlns:w16sdtdh="http://schemas.microsoft.com/office/word/2020/wordml/sdtdatahash" xmlns:w16sdtfl="http://schemas.microsoft.com/office/word/2024/wordml/sdtformatlock" xmlns:w16se="http://schemas.microsoft.com/office/word/2015/wordml/symex" mc:Ignorable="w14 w15 w16se w16cid w16 w16cex w16sdtdh w16sdtfl w16du">
+<w:styles xmlns:mc="http://schemas.openxmlformats.org/markup-compatibility/2006" xmlns:r="http://schemas.openxmlformats.org/officeDocument/2006/relationships" xmlns:w="http://schemas.openxmlformats.org/wordprocessingml/2006/main" xmlns:w14="http://schemas.microsoft.com/office/word/2010/wordml" xmlns:w15="http://schemas.microsoft.com/office/word/2012/wordml" xmlns:w16cex="http://schemas.microsoft.com/office/word/2018/wordml/cex" xmlns:w16cid="http://schemas.microsoft.com/office/word/2016/wordml/cid" xmlns:w16="http://schemas.microsoft.com/office/word/2018/wordml" xmlns:w16sdtdh="http://schemas.microsoft.com/office/word/2020/wordml/sdtdatahash" xmlns:w16sdtfl="http://schemas.microsoft.com/office/word/2024/wordml/sdtformatlock" xmlns:w16se="http://schemas.microsoft.com/office/word/2015/wordml/symex" xmlns:w16du="http://schemas.microsoft.com/office/word/2023/wordml/word16du" mc:Ignorable="w14 w15 w16se w16cid w16 w16cex w16sdtdh w16sdtfl w16du">
   <w:docDefaults>
     <w:rPrDefault>
       <w:rPr>
@@ -27784,6 +29982,7 @@
   <w:style w:type="character" w:default="1" w:styleId="Kappaleenoletusfontti">
     <w:name w:val="Default Paragraph Font"/>
     <w:uiPriority w:val="1"/>
+    <w:semiHidden/>
     <w:unhideWhenUsed/>
   </w:style>
   <w:style w:type="table" w:default="1" w:styleId="Normaalitaulukko">

</xml_diff>